<commit_message>
Added some graph info
</commit_message>
<xml_diff>
--- a/Assignment 2 - Draft_2.docx
+++ b/Assignment 2 - Draft_2.docx
@@ -246,7 +246,21 @@
               <w:rFonts w:eastAsia="Cambria" w:cstheme="minorHAnsi"/>
               <w:color w:val="000000"/>
             </w:rPr>
-            <w:t>AA/BB</w:t>
+            <w:t>29</w:t>
+          </w:r>
+          <w:r>
+            <w:rPr>
+              <w:rFonts w:eastAsia="Cambria" w:cstheme="minorHAnsi"/>
+              <w:color w:val="000000"/>
+            </w:rPr>
+            <w:t>/</w:t>
+          </w:r>
+          <w:r>
+            <w:rPr>
+              <w:rFonts w:eastAsia="Cambria" w:cstheme="minorHAnsi"/>
+              <w:color w:val="000000"/>
+            </w:rPr>
+            <w:t>05</w:t>
           </w:r>
           <w:r>
             <w:rPr>
@@ -318,7 +332,7 @@
               <w:color w:val="000000"/>
               <w:sz w:val="40"/>
             </w:rPr>
-            <w:t xml:space="preserve">MONTH </w:t>
+            <w:t xml:space="preserve">May </w:t>
           </w:r>
           <w:r>
             <w:rPr>
@@ -818,6 +832,7 @@
         </w:rPr>
         <w:t xml:space="preserve"> </w:t>
       </w:r>
+      <w:proofErr w:type="spellStart"/>
       <w:r>
         <w:rPr>
           <w:vertAlign w:val="superscript"/>
@@ -827,6 +842,7 @@
       <w:r>
         <w:t>C</w:t>
       </w:r>
+      <w:proofErr w:type="spellEnd"/>
       <w:r>
         <w:t>, humidity below zero</w:t>
       </w:r>
@@ -1161,9 +1177,11 @@
             <w:tcW w:w="1502" w:type="dxa"/>
           </w:tcPr>
           <w:p>
+            <w:proofErr w:type="spellStart"/>
             <w:r>
               <w:t>Atemp</w:t>
             </w:r>
+            <w:proofErr w:type="spellEnd"/>
           </w:p>
         </w:tc>
         <w:tc>
@@ -1722,7 +1740,21 @@
         <w:rPr>
           <w:rFonts w:ascii="Aptos" w:hAnsi="Aptos"/>
         </w:rPr>
-        <w:t>(GeeksforGeeks 2026)</w:t>
+        <w:t>(</w:t>
+      </w:r>
+      <w:proofErr w:type="spellStart"/>
+      <w:r>
+        <w:rPr>
+          <w:rFonts w:ascii="Aptos" w:hAnsi="Aptos"/>
+        </w:rPr>
+        <w:t>GeeksforGeeks</w:t>
+      </w:r>
+      <w:proofErr w:type="spellEnd"/>
+      <w:r>
+        <w:rPr>
+          <w:rFonts w:ascii="Aptos" w:hAnsi="Aptos"/>
+        </w:rPr>
+        <w:t xml:space="preserve"> 2026)</w:t>
       </w:r>
       <w:r>
         <w:fldChar w:fldCharType="end"/>
@@ -1825,105 +1857,1121 @@
         <w:t>seasons and holidays will affect the overall shape.</w:t>
       </w:r>
     </w:p>
-    <w:p/>
-    <w:p>
-      <w:r>
-        <w:t xml:space="preserve">Null values </w:t>
-      </w:r>
-      <w:r>
-        <w:t>are replaced with the mean.</w:t>
-      </w:r>
-    </w:p>
-    <w:p>
-      <w:r>
-        <w:t xml:space="preserve">Fix outliers. Anything outside of 3 stds of the </w:t>
-      </w:r>
-      <w:r>
-        <w:t>mean</w:t>
-      </w:r>
-      <w:r>
-        <w:t xml:space="preserve"> (encapsulates 99% of all considered normal points)</w:t>
-      </w:r>
-      <w:r>
-        <w:t>. All negative values will be change to 0.</w:t>
-      </w:r>
-      <w:r>
-        <w:t xml:space="preserve"> Will </w:t>
-      </w:r>
-      <w:r>
-        <w:t>inevitably</w:t>
-      </w:r>
-      <w:r>
-        <w:t xml:space="preserve"> remove some</w:t>
-      </w:r>
-      <w:r>
-        <w:t xml:space="preserve"> actual crazy outliers. The only way is</w:t>
-      </w:r>
-      <w:r>
-        <w:t xml:space="preserve"> to</w:t>
-      </w:r>
-      <w:r>
-        <w:t xml:space="preserve"> actually compare </w:t>
-      </w:r>
-      <w:r>
-        <w:t xml:space="preserve">values </w:t>
-      </w:r>
-      <w:r>
-        <w:t xml:space="preserve">with another dataset. E.g. </w:t>
-      </w:r>
-      <w:r>
-        <w:t xml:space="preserve">Temperature values </w:t>
-      </w:r>
-      <w:r>
-        <w:t>with the comparison from the BOM dataset</w:t>
-      </w:r>
-      <w:r>
-        <w:t>.</w:t>
-      </w:r>
-      <w:r>
-        <w:t xml:space="preserve"> </w:t>
-      </w:r>
-      <w:r>
-        <w:t xml:space="preserve">This is done twice </w:t>
-      </w:r>
-      <w:r>
-        <w:t>to achieve 98.01%</w:t>
-      </w:r>
-      <w:r>
-        <w:t xml:space="preserve"> of the complete dataset</w:t>
-      </w:r>
-      <w:r>
-        <w:t>.</w:t>
-      </w:r>
-    </w:p>
-    <w:p/>
-    <w:p/>
+    <w:p>
+      <w:r>
+        <w:t>To remove obviously incorrect data</w:t>
+      </w:r>
+      <w:r>
+        <w:t xml:space="preserve">, only the correct data </w:t>
+      </w:r>
+      <w:r>
+        <w:t xml:space="preserve">within 3 standard deviations of the mean (e.g. 99% of the data) will be kept. </w:t>
+      </w:r>
+      <w:r>
+        <w:t>If t</w:t>
+      </w:r>
+      <w:r>
+        <w:t xml:space="preserve">he lower bound of the standard deviation </w:t>
+      </w:r>
+      <w:r>
+        <w:t>is below 0, then it will be changed to 0.</w:t>
+      </w:r>
+      <w:r>
+        <w:t xml:space="preserve"> This keeping of 3 standard deviations is done twice to </w:t>
+      </w:r>
+      <w:r>
+        <w:t xml:space="preserve">make sure that all unlikely outliers are removed from the dataset. </w:t>
+      </w:r>
+      <w:r>
+        <w:t xml:space="preserve">In doing this it will inevitably remove some legitimate outliers from the dataset, however to the only way to verify </w:t>
+      </w:r>
+      <w:r>
+        <w:t xml:space="preserve">this is compare it </w:t>
+      </w:r>
+      <w:r>
+        <w:t xml:space="preserve">another verified correct database. For example, verifying the temperature values against those stored within the </w:t>
+      </w:r>
+      <w:r>
+        <w:t>Bureau</w:t>
+      </w:r>
+      <w:r>
+        <w:t xml:space="preserve"> of Meteorolog</w:t>
+      </w:r>
+      <w:r>
+        <w:t>y’s database.</w:t>
+      </w:r>
+    </w:p>
+    <w:p>
+      <w:r>
+        <w:t>Doing this all gives the information presented within Table 2.</w:t>
+      </w:r>
+    </w:p>
+    <w:p>
+      <w:pPr>
+        <w:pStyle w:val="Caption"/>
+        <w:keepNext/>
+      </w:pPr>
+      <w:r>
+        <w:t xml:space="preserve">Table </w:t>
+      </w:r>
+      <w:fldSimple w:instr=" SEQ Table \* ARABIC ">
+        <w:r>
+          <w:rPr>
+            <w:noProof/>
+          </w:rPr>
+          <w:t>2</w:t>
+        </w:r>
+      </w:fldSimple>
+      <w:r>
+        <w:t xml:space="preserve"> - Cleaned 4 Number Summary</w:t>
+      </w:r>
+    </w:p>
+    <w:tbl>
+      <w:tblPr>
+        <w:tblStyle w:val="TableGrid"/>
+        <w:tblW w:w="0" w:type="auto"/>
+        <w:tblLook w:val="04A0" w:firstRow="1" w:lastRow="0" w:firstColumn="1" w:lastColumn="0" w:noHBand="0" w:noVBand="1"/>
+      </w:tblPr>
+      <w:tblGrid>
+        <w:gridCol w:w="1502"/>
+        <w:gridCol w:w="1502"/>
+        <w:gridCol w:w="1503"/>
+        <w:gridCol w:w="1503"/>
+        <w:gridCol w:w="1503"/>
+        <w:gridCol w:w="1503"/>
+      </w:tblGrid>
+      <w:tr>
+        <w:tc>
+          <w:tcPr>
+            <w:tcW w:w="1502" w:type="dxa"/>
+          </w:tcPr>
+          <w:p/>
+        </w:tc>
+        <w:tc>
+          <w:tcPr>
+            <w:tcW w:w="1502" w:type="dxa"/>
+          </w:tcPr>
+          <w:p>
+            <w:r>
+              <w:t>Min</w:t>
+            </w:r>
+          </w:p>
+        </w:tc>
+        <w:tc>
+          <w:tcPr>
+            <w:tcW w:w="1503" w:type="dxa"/>
+          </w:tcPr>
+          <w:p>
+            <w:r>
+              <w:t>Max</w:t>
+            </w:r>
+          </w:p>
+        </w:tc>
+        <w:tc>
+          <w:tcPr>
+            <w:tcW w:w="1503" w:type="dxa"/>
+          </w:tcPr>
+          <w:p>
+            <w:r>
+              <w:t>Mean</w:t>
+            </w:r>
+          </w:p>
+        </w:tc>
+        <w:tc>
+          <w:tcPr>
+            <w:tcW w:w="1503" w:type="dxa"/>
+          </w:tcPr>
+          <w:p>
+            <w:r>
+              <w:t>Median</w:t>
+            </w:r>
+          </w:p>
+        </w:tc>
+        <w:tc>
+          <w:tcPr>
+            <w:tcW w:w="1503" w:type="dxa"/>
+          </w:tcPr>
+          <w:p>
+            <w:r>
+              <w:t>Standard Deviation</w:t>
+            </w:r>
+          </w:p>
+        </w:tc>
+      </w:tr>
+      <w:tr>
+        <w:tc>
+          <w:tcPr>
+            <w:tcW w:w="1502" w:type="dxa"/>
+          </w:tcPr>
+          <w:p>
+            <w:r>
+              <w:t>Holiday</w:t>
+            </w:r>
+          </w:p>
+        </w:tc>
+        <w:tc>
+          <w:tcPr>
+            <w:tcW w:w="1502" w:type="dxa"/>
+          </w:tcPr>
+          <w:p>
+            <w:r>
+              <w:t>0.0</w:t>
+            </w:r>
+          </w:p>
+        </w:tc>
+        <w:tc>
+          <w:tcPr>
+            <w:tcW w:w="1503" w:type="dxa"/>
+          </w:tcPr>
+          <w:p>
+            <w:r>
+              <w:t>1.00</w:t>
+            </w:r>
+          </w:p>
+        </w:tc>
+        <w:tc>
+          <w:tcPr>
+            <w:tcW w:w="1503" w:type="dxa"/>
+          </w:tcPr>
+          <w:p>
+            <w:r>
+              <w:t>0.07</w:t>
+            </w:r>
+          </w:p>
+        </w:tc>
+        <w:tc>
+          <w:tcPr>
+            <w:tcW w:w="1503" w:type="dxa"/>
+          </w:tcPr>
+          <w:p>
+            <w:r>
+              <w:t>0.0</w:t>
+            </w:r>
+          </w:p>
+        </w:tc>
+        <w:tc>
+          <w:tcPr>
+            <w:tcW w:w="1503" w:type="dxa"/>
+          </w:tcPr>
+          <w:p>
+            <w:r>
+              <w:t>0.26</w:t>
+            </w:r>
+          </w:p>
+        </w:tc>
+      </w:tr>
+      <w:tr>
+        <w:tc>
+          <w:tcPr>
+            <w:tcW w:w="1502" w:type="dxa"/>
+          </w:tcPr>
+          <w:p>
+            <w:r>
+              <w:t>Working Day</w:t>
+            </w:r>
+          </w:p>
+        </w:tc>
+        <w:tc>
+          <w:tcPr>
+            <w:tcW w:w="1502" w:type="dxa"/>
+          </w:tcPr>
+          <w:p>
+            <w:r>
+              <w:t>0.0</w:t>
+            </w:r>
+          </w:p>
+        </w:tc>
+        <w:tc>
+          <w:tcPr>
+            <w:tcW w:w="1503" w:type="dxa"/>
+          </w:tcPr>
+          <w:p>
+            <w:r>
+              <w:t>1.00</w:t>
+            </w:r>
+          </w:p>
+        </w:tc>
+        <w:tc>
+          <w:tcPr>
+            <w:tcW w:w="1503" w:type="dxa"/>
+          </w:tcPr>
+          <w:p>
+            <w:r>
+              <w:t>0.6</w:t>
+            </w:r>
+            <w:r>
+              <w:t>7</w:t>
+            </w:r>
+          </w:p>
+        </w:tc>
+        <w:tc>
+          <w:tcPr>
+            <w:tcW w:w="1503" w:type="dxa"/>
+          </w:tcPr>
+          <w:p>
+            <w:r>
+              <w:t>1.0</w:t>
+            </w:r>
+          </w:p>
+        </w:tc>
+        <w:tc>
+          <w:tcPr>
+            <w:tcW w:w="1503" w:type="dxa"/>
+          </w:tcPr>
+          <w:p>
+            <w:r>
+              <w:t>0.47</w:t>
+            </w:r>
+          </w:p>
+        </w:tc>
+      </w:tr>
+      <w:tr>
+        <w:tc>
+          <w:tcPr>
+            <w:tcW w:w="1502" w:type="dxa"/>
+          </w:tcPr>
+          <w:p>
+            <w:r>
+              <w:t>Temp</w:t>
+            </w:r>
+          </w:p>
+        </w:tc>
+        <w:tc>
+          <w:tcPr>
+            <w:tcW w:w="1502" w:type="dxa"/>
+          </w:tcPr>
+          <w:p>
+            <w:r>
+              <w:t>9.90</w:t>
+            </w:r>
+          </w:p>
+        </w:tc>
+        <w:tc>
+          <w:tcPr>
+            <w:tcW w:w="1503" w:type="dxa"/>
+          </w:tcPr>
+          <w:p>
+            <w:r>
+              <w:t>33.68</w:t>
+            </w:r>
+          </w:p>
+        </w:tc>
+        <w:tc>
+          <w:tcPr>
+            <w:tcW w:w="1503" w:type="dxa"/>
+          </w:tcPr>
+          <w:p>
+            <w:r>
+              <w:t>22.</w:t>
+            </w:r>
+            <w:r>
+              <w:t>05</w:t>
+            </w:r>
+          </w:p>
+        </w:tc>
+        <w:tc>
+          <w:tcPr>
+            <w:tcW w:w="1503" w:type="dxa"/>
+          </w:tcPr>
+          <w:p>
+            <w:r>
+              <w:t>2</w:t>
+            </w:r>
+            <w:r>
+              <w:t>2.1</w:t>
+            </w:r>
+          </w:p>
+        </w:tc>
+        <w:tc>
+          <w:tcPr>
+            <w:tcW w:w="1503" w:type="dxa"/>
+          </w:tcPr>
+          <w:p>
+            <w:r>
+              <w:t>4.82</w:t>
+            </w:r>
+          </w:p>
+        </w:tc>
+      </w:tr>
+      <w:tr>
+        <w:tc>
+          <w:tcPr>
+            <w:tcW w:w="1502" w:type="dxa"/>
+          </w:tcPr>
+          <w:p>
+            <w:proofErr w:type="spellStart"/>
+            <w:r>
+              <w:t>Atemp</w:t>
+            </w:r>
+            <w:proofErr w:type="spellEnd"/>
+          </w:p>
+        </w:tc>
+        <w:tc>
+          <w:tcPr>
+            <w:tcW w:w="1502" w:type="dxa"/>
+          </w:tcPr>
+          <w:p>
+            <w:r>
+              <w:t>10.00</w:t>
+            </w:r>
+          </w:p>
+        </w:tc>
+        <w:tc>
+          <w:tcPr>
+            <w:tcW w:w="1503" w:type="dxa"/>
+          </w:tcPr>
+          <w:p>
+            <w:r>
+              <w:t>3</w:t>
+            </w:r>
+            <w:r>
+              <w:t>4.00</w:t>
+            </w:r>
+          </w:p>
+        </w:tc>
+        <w:tc>
+          <w:tcPr>
+            <w:tcW w:w="1503" w:type="dxa"/>
+          </w:tcPr>
+          <w:p>
+            <w:r>
+              <w:t>22.</w:t>
+            </w:r>
+            <w:r>
+              <w:t>38</w:t>
+            </w:r>
+          </w:p>
+        </w:tc>
+        <w:tc>
+          <w:tcPr>
+            <w:tcW w:w="1503" w:type="dxa"/>
+          </w:tcPr>
+          <w:p>
+            <w:r>
+              <w:t>22.</w:t>
+            </w:r>
+            <w:r>
+              <w:t>42</w:t>
+            </w:r>
+          </w:p>
+        </w:tc>
+        <w:tc>
+          <w:tcPr>
+            <w:tcW w:w="1503" w:type="dxa"/>
+          </w:tcPr>
+          <w:p>
+            <w:r>
+              <w:t>5.</w:t>
+            </w:r>
+            <w:r>
+              <w:t>04</w:t>
+            </w:r>
+          </w:p>
+        </w:tc>
+      </w:tr>
+      <w:tr>
+        <w:tc>
+          <w:tcPr>
+            <w:tcW w:w="1502" w:type="dxa"/>
+          </w:tcPr>
+          <w:p>
+            <w:r>
+              <w:t>Humidity</w:t>
+            </w:r>
+          </w:p>
+        </w:tc>
+        <w:tc>
+          <w:tcPr>
+            <w:tcW w:w="1502" w:type="dxa"/>
+          </w:tcPr>
+          <w:p>
+            <w:r>
+              <w:t>25.53</w:t>
+            </w:r>
+          </w:p>
+        </w:tc>
+        <w:tc>
+          <w:tcPr>
+            <w:tcW w:w="1503" w:type="dxa"/>
+          </w:tcPr>
+          <w:p>
+            <w:r>
+              <w:t>91.40</w:t>
+            </w:r>
+          </w:p>
+        </w:tc>
+        <w:tc>
+          <w:tcPr>
+            <w:tcW w:w="1503" w:type="dxa"/>
+          </w:tcPr>
+          <w:p>
+            <w:r>
+              <w:t>5</w:t>
+            </w:r>
+            <w:r>
+              <w:t>7.75</w:t>
+            </w:r>
+          </w:p>
+        </w:tc>
+        <w:tc>
+          <w:tcPr>
+            <w:tcW w:w="1503" w:type="dxa"/>
+          </w:tcPr>
+          <w:p>
+            <w:r>
+              <w:t>58</w:t>
+            </w:r>
+            <w:r>
+              <w:t>.40</w:t>
+            </w:r>
+          </w:p>
+        </w:tc>
+        <w:tc>
+          <w:tcPr>
+            <w:tcW w:w="1503" w:type="dxa"/>
+          </w:tcPr>
+          <w:p>
+            <w:r>
+              <w:t>13.01</w:t>
+            </w:r>
+          </w:p>
+        </w:tc>
+      </w:tr>
+      <w:tr>
+        <w:tc>
+          <w:tcPr>
+            <w:tcW w:w="1502" w:type="dxa"/>
+          </w:tcPr>
+          <w:p>
+            <w:r>
+              <w:t>Windspeed</w:t>
+            </w:r>
+          </w:p>
+        </w:tc>
+        <w:tc>
+          <w:tcPr>
+            <w:tcW w:w="1502" w:type="dxa"/>
+          </w:tcPr>
+          <w:p>
+            <w:r>
+              <w:t>2.90</w:t>
+            </w:r>
+          </w:p>
+        </w:tc>
+        <w:tc>
+          <w:tcPr>
+            <w:tcW w:w="1503" w:type="dxa"/>
+          </w:tcPr>
+          <w:p>
+            <w:r>
+              <w:t>17.80</w:t>
+            </w:r>
+          </w:p>
+        </w:tc>
+        <w:tc>
+          <w:tcPr>
+            <w:tcW w:w="1503" w:type="dxa"/>
+          </w:tcPr>
+          <w:p>
+            <w:r>
+              <w:t>10.33</w:t>
+            </w:r>
+          </w:p>
+        </w:tc>
+        <w:tc>
+          <w:tcPr>
+            <w:tcW w:w="1503" w:type="dxa"/>
+          </w:tcPr>
+          <w:p>
+            <w:r>
+              <w:t>10.3</w:t>
+            </w:r>
+            <w:r>
+              <w:t>0</w:t>
+            </w:r>
+          </w:p>
+        </w:tc>
+        <w:tc>
+          <w:tcPr>
+            <w:tcW w:w="1503" w:type="dxa"/>
+          </w:tcPr>
+          <w:p>
+            <w:r>
+              <w:t>3.</w:t>
+            </w:r>
+            <w:r>
+              <w:t>01</w:t>
+            </w:r>
+          </w:p>
+        </w:tc>
+      </w:tr>
+      <w:tr>
+        <w:tc>
+          <w:tcPr>
+            <w:tcW w:w="1502" w:type="dxa"/>
+          </w:tcPr>
+          <w:p>
+            <w:r>
+              <w:t>Count</w:t>
+            </w:r>
+          </w:p>
+        </w:tc>
+        <w:tc>
+          <w:tcPr>
+            <w:tcW w:w="1502" w:type="dxa"/>
+          </w:tcPr>
+          <w:p>
+            <w:r>
+              <w:t>0.00</w:t>
+            </w:r>
+          </w:p>
+        </w:tc>
+        <w:tc>
+          <w:tcPr>
+            <w:tcW w:w="1503" w:type="dxa"/>
+          </w:tcPr>
+          <w:p>
+            <w:r>
+              <w:t>1522.00</w:t>
+            </w:r>
+          </w:p>
+        </w:tc>
+        <w:tc>
+          <w:tcPr>
+            <w:tcW w:w="1503" w:type="dxa"/>
+          </w:tcPr>
+          <w:p>
+            <w:r>
+              <w:t>678.51</w:t>
+            </w:r>
+          </w:p>
+        </w:tc>
+        <w:tc>
+          <w:tcPr>
+            <w:tcW w:w="1503" w:type="dxa"/>
+          </w:tcPr>
+          <w:p>
+            <w:r>
+              <w:t>710.00</w:t>
+            </w:r>
+          </w:p>
+        </w:tc>
+        <w:tc>
+          <w:tcPr>
+            <w:tcW w:w="1503" w:type="dxa"/>
+          </w:tcPr>
+          <w:p>
+            <w:pPr>
+              <w:keepNext/>
+            </w:pPr>
+            <w:r>
+              <w:t>313.68</w:t>
+            </w:r>
+          </w:p>
+        </w:tc>
+      </w:tr>
+    </w:tbl>
+    <w:p>
+      <w:pPr>
+        <w:pStyle w:val="Caption"/>
+      </w:pPr>
+      <w:r>
+        <w:t>Source – Author</w:t>
+      </w:r>
+    </w:p>
     <w:p>
       <w:pPr>
         <w:pStyle w:val="Heading1"/>
       </w:pPr>
       <w:r>
-        <w:t>Conclusion</w:t>
+        <w:t>Cleaned Exploratory Data Analysis:</w:t>
+      </w:r>
+    </w:p>
+    <w:p>
+      <w:r>
+        <w:t xml:space="preserve">Within </w:t>
+      </w:r>
+      <w:r>
+        <w:t>cleaned dataset</w:t>
+      </w:r>
+      <w:r>
+        <w:t xml:space="preserve">, temperature as the greatest </w:t>
+      </w:r>
+      <w:r>
+        <w:t>effect</w:t>
+      </w:r>
+      <w:r>
+        <w:t xml:space="preserve"> </w:t>
+      </w:r>
+      <w:r>
+        <w:t xml:space="preserve">on whether people decide to rent a bike. </w:t>
+      </w:r>
+      <w:r>
+        <w:t xml:space="preserve">As shown in </w:t>
+      </w:r>
+      <w:r>
+        <w:fldChar w:fldCharType="begin"/>
+      </w:r>
+      <w:r>
+        <w:instrText xml:space="preserve"> REF _Ref228358706 \h </w:instrText>
+      </w:r>
+      <w:r>
+        <w:fldChar w:fldCharType="separate"/>
+      </w:r>
+      <w:r>
+        <w:t xml:space="preserve">Figure </w:t>
+      </w:r>
+      <w:r>
+        <w:rPr>
+          <w:noProof/>
+        </w:rPr>
+        <w:t>3</w:t>
+      </w:r>
+      <w:r>
+        <w:fldChar w:fldCharType="end"/>
+      </w:r>
+      <w:r>
+        <w:t xml:space="preserve"> and </w:t>
+      </w:r>
+      <w:r>
+        <w:fldChar w:fldCharType="begin"/>
+      </w:r>
+      <w:r>
+        <w:instrText xml:space="preserve"> REF _Ref228358712 \h </w:instrText>
+      </w:r>
+      <w:r>
+        <w:fldChar w:fldCharType="separate"/>
+      </w:r>
+      <w:r>
+        <w:t xml:space="preserve">Figure </w:t>
+      </w:r>
+      <w:r>
+        <w:rPr>
+          <w:noProof/>
+        </w:rPr>
+        <w:t>4</w:t>
+      </w:r>
+      <w:r>
+        <w:fldChar w:fldCharType="end"/>
+      </w:r>
+      <w:r>
+        <w:t xml:space="preserve">, </w:t>
+      </w:r>
+      <w:r>
+        <w:t xml:space="preserve">the highest daily rental numbers </w:t>
+      </w:r>
+      <w:r>
+        <w:t xml:space="preserve">(&gt;600) are </w:t>
+      </w:r>
+      <w:r>
+        <w:t>between 20-27</w:t>
+      </w:r>
+      <w:r>
+        <w:rPr>
+          <w:vertAlign w:val="superscript"/>
+        </w:rPr>
+        <w:t>o</w:t>
+      </w:r>
+      <w:r>
+        <w:t>C</w:t>
+      </w:r>
+      <w:r>
+        <w:t xml:space="preserve">. The number of bike rentals drastically falls off </w:t>
+      </w:r>
+      <w:r>
+        <w:t>when the temperature is either &lt;18</w:t>
+      </w:r>
+      <w:r>
+        <w:rPr>
+          <w:vertAlign w:val="superscript"/>
+        </w:rPr>
+        <w:t>o</w:t>
+      </w:r>
+      <w:r>
+        <w:t>C</w:t>
+      </w:r>
+      <w:r>
+        <w:t xml:space="preserve"> and &gt;30</w:t>
+      </w:r>
+      <w:r>
+        <w:rPr>
+          <w:vertAlign w:val="superscript"/>
+        </w:rPr>
+        <w:t>o</w:t>
+      </w:r>
+      <w:r>
+        <w:t>C.</w:t>
+      </w:r>
+      <w:r>
+        <w:t xml:space="preserve"> The seasons do not seem to line up with the temp</w:t>
+      </w:r>
+      <w:r>
+        <w:t>erature and overall do not affect the</w:t>
+      </w:r>
+      <w:r>
+        <w:t xml:space="preserve"> bike rental numbers.</w:t>
+      </w:r>
+      <w:r>
+        <w:t xml:space="preserve"> With most people renting bicycles in summer and winter</w:t>
+      </w:r>
+      <w:r>
+        <w:t xml:space="preserve"> (</w:t>
+      </w:r>
+      <w:r>
+        <w:fldChar w:fldCharType="begin"/>
+      </w:r>
+      <w:r>
+        <w:instrText xml:space="preserve"> REF _Ref228358706 \h </w:instrText>
+      </w:r>
+      <w:r>
+        <w:fldChar w:fldCharType="separate"/>
+      </w:r>
+      <w:r>
+        <w:t xml:space="preserve">Figure </w:t>
+      </w:r>
+      <w:r>
+        <w:rPr>
+          <w:noProof/>
+        </w:rPr>
+        <w:t>3</w:t>
+      </w:r>
+      <w:r>
+        <w:fldChar w:fldCharType="end"/>
+      </w:r>
+      <w:r>
+        <w:t>)</w:t>
+      </w:r>
+      <w:r>
+        <w:t xml:space="preserve">, </w:t>
+      </w:r>
+      <w:r>
+        <w:t xml:space="preserve">the seasons </w:t>
+      </w:r>
+      <w:r>
+        <w:t>lining up to when schools/work/</w:t>
+      </w:r>
+      <w:r>
+        <w:t>people have the largest sets of holidays.</w:t>
+      </w:r>
+    </w:p>
+    <w:p>
+      <w:pPr>
+        <w:keepNext/>
+        <w:jc w:val="center"/>
+      </w:pPr>
+      <w:r>
+        <w:lastRenderedPageBreak/>
+        <w:drawing>
+          <wp:inline distT="0" distB="0" distL="0" distR="0" wp14:anchorId="76EDB0C5" wp14:editId="589A6224">
+            <wp:extent cx="4067033" cy="3009496"/>
+            <wp:effectExtent l="0" t="0" r="0" b="635"/>
+            <wp:docPr id="234802912" name="Picture 1"/>
+            <wp:cNvGraphicFramePr>
+              <a:graphicFrameLocks xmlns:a="http://schemas.openxmlformats.org/drawingml/2006/main" noChangeAspect="1"/>
+            </wp:cNvGraphicFramePr>
+            <a:graphic xmlns:a="http://schemas.openxmlformats.org/drawingml/2006/main">
+              <a:graphicData uri="http://schemas.openxmlformats.org/drawingml/2006/picture">
+                <pic:pic xmlns:pic="http://schemas.openxmlformats.org/drawingml/2006/picture">
+                  <pic:nvPicPr>
+                    <pic:cNvPr id="234802912" name=""/>
+                    <pic:cNvPicPr/>
+                  </pic:nvPicPr>
+                  <pic:blipFill>
+                    <a:blip r:embed="rId13"/>
+                    <a:stretch>
+                      <a:fillRect/>
+                    </a:stretch>
+                  </pic:blipFill>
+                  <pic:spPr>
+                    <a:xfrm>
+                      <a:off x="0" y="0"/>
+                      <a:ext cx="4072524" cy="3013559"/>
+                    </a:xfrm>
+                    <a:prstGeom prst="rect">
+                      <a:avLst/>
+                    </a:prstGeom>
+                  </pic:spPr>
+                </pic:pic>
+              </a:graphicData>
+            </a:graphic>
+          </wp:inline>
+        </w:drawing>
+      </w:r>
+    </w:p>
+    <w:p>
+      <w:pPr>
+        <w:pStyle w:val="Caption"/>
+      </w:pPr>
+      <w:bookmarkStart w:id="3" w:name="_Ref228358706"/>
+      <w:r>
+        <w:t xml:space="preserve">Figure </w:t>
+      </w:r>
+      <w:fldSimple w:instr=" SEQ Figure \* ARABIC ">
+        <w:r>
+          <w:rPr>
+            <w:noProof/>
+          </w:rPr>
+          <w:t>3</w:t>
+        </w:r>
+      </w:fldSimple>
+      <w:bookmarkEnd w:id="3"/>
+      <w:r>
+        <w:t xml:space="preserve"> - The effects of seasonality and temperature affecting the number of bike rentals</w:t>
+      </w:r>
+    </w:p>
+    <w:p>
+      <w:pPr>
+        <w:pStyle w:val="Caption"/>
+      </w:pPr>
+      <w:r>
+        <w:t xml:space="preserve">Source </w:t>
+      </w:r>
+      <w:r>
+        <w:t>–</w:t>
+      </w:r>
+      <w:r>
+        <w:t xml:space="preserve"> Author</w:t>
+      </w:r>
+    </w:p>
+    <w:p>
+      <w:r>
+        <w:t>The weather seems to have a larger effect on bike rentals (</w:t>
+      </w:r>
+      <w:r>
+        <w:fldChar w:fldCharType="begin"/>
+      </w:r>
+      <w:r>
+        <w:instrText xml:space="preserve"> REF _Ref228358712 \h </w:instrText>
+      </w:r>
+      <w:r>
+        <w:fldChar w:fldCharType="separate"/>
+      </w:r>
+      <w:r>
+        <w:t xml:space="preserve">Figure </w:t>
+      </w:r>
+      <w:r>
+        <w:rPr>
+          <w:noProof/>
+        </w:rPr>
+        <w:t>4</w:t>
+      </w:r>
+      <w:r>
+        <w:fldChar w:fldCharType="end"/>
+      </w:r>
+      <w:r>
+        <w:t>). With when rain or high chance of imminent rain is coming bike rental numbers drop.</w:t>
+      </w:r>
+      <w:r>
+        <w:t xml:space="preserve"> However</w:t>
+      </w:r>
+      <w:r>
+        <w:t xml:space="preserve">, in the overall trends </w:t>
+      </w:r>
+      <w:r>
+        <w:t>weather is not that much of an impact.</w:t>
       </w:r>
     </w:p>
     <w:p/>
+    <w:p>
+      <w:pPr>
+        <w:keepNext/>
+        <w:jc w:val="center"/>
+      </w:pPr>
+      <w:r>
+        <w:drawing>
+          <wp:inline distT="0" distB="0" distL="0" distR="0" wp14:anchorId="2142C84C" wp14:editId="3443642A">
+            <wp:extent cx="4054718" cy="3019700"/>
+            <wp:effectExtent l="0" t="0" r="3175" b="9525"/>
+            <wp:docPr id="1796451686" name="Picture 1"/>
+            <wp:cNvGraphicFramePr>
+              <a:graphicFrameLocks xmlns:a="http://schemas.openxmlformats.org/drawingml/2006/main" noChangeAspect="1"/>
+            </wp:cNvGraphicFramePr>
+            <a:graphic xmlns:a="http://schemas.openxmlformats.org/drawingml/2006/main">
+              <a:graphicData uri="http://schemas.openxmlformats.org/drawingml/2006/picture">
+                <pic:pic xmlns:pic="http://schemas.openxmlformats.org/drawingml/2006/picture">
+                  <pic:nvPicPr>
+                    <pic:cNvPr id="1796451686" name=""/>
+                    <pic:cNvPicPr/>
+                  </pic:nvPicPr>
+                  <pic:blipFill>
+                    <a:blip r:embed="rId14"/>
+                    <a:stretch>
+                      <a:fillRect/>
+                    </a:stretch>
+                  </pic:blipFill>
+                  <pic:spPr>
+                    <a:xfrm>
+                      <a:off x="0" y="0"/>
+                      <a:ext cx="4063930" cy="3026561"/>
+                    </a:xfrm>
+                    <a:prstGeom prst="rect">
+                      <a:avLst/>
+                    </a:prstGeom>
+                  </pic:spPr>
+                </pic:pic>
+              </a:graphicData>
+            </a:graphic>
+          </wp:inline>
+        </w:drawing>
+      </w:r>
+    </w:p>
+    <w:p>
+      <w:pPr>
+        <w:pStyle w:val="Caption"/>
+      </w:pPr>
+      <w:bookmarkStart w:id="4" w:name="_Ref228358712"/>
+      <w:r>
+        <w:t xml:space="preserve">Figure </w:t>
+      </w:r>
+      <w:fldSimple w:instr=" SEQ Figure \* ARABIC ">
+        <w:r>
+          <w:rPr>
+            <w:noProof/>
+          </w:rPr>
+          <w:t>4</w:t>
+        </w:r>
+      </w:fldSimple>
+      <w:bookmarkEnd w:id="4"/>
+      <w:r>
+        <w:t xml:space="preserve"> - Combined effects of the temperature and weather on bike rentals</w:t>
+      </w:r>
+    </w:p>
+    <w:p>
+      <w:pPr>
+        <w:pStyle w:val="Caption"/>
+      </w:pPr>
+      <w:r>
+        <w:t>Source – Author</w:t>
+      </w:r>
+    </w:p>
+    <w:p>
+      <w:r>
+        <w:t xml:space="preserve">Over the summer holidays </w:t>
+      </w:r>
+      <w:r>
+        <w:t>(November – March)</w:t>
+      </w:r>
+      <w:r>
+        <w:t xml:space="preserve"> there is large uptick in the number of bike rentals. This can be attributed to </w:t>
+      </w:r>
+      <w:r>
+        <w:t xml:space="preserve">a mixture of parents spending time with their </w:t>
+      </w:r>
+      <w:r>
+        <w:lastRenderedPageBreak/>
+        <w:t xml:space="preserve">children over Christmas and </w:t>
+      </w:r>
+      <w:r>
+        <w:t xml:space="preserve">the children having the spare time over the school holidays. In conjunction with the generally </w:t>
+      </w:r>
+      <w:r>
+        <w:t>mid temperature (~20-27</w:t>
+      </w:r>
+      <w:r>
+        <w:rPr>
+          <w:vertAlign w:val="superscript"/>
+        </w:rPr>
+        <w:t>o</w:t>
+      </w:r>
+      <w:r>
+        <w:t>C)</w:t>
+      </w:r>
+      <w:r>
+        <w:t xml:space="preserve">, overall clear and slightly cloudy weather, contributes to </w:t>
+      </w:r>
+      <w:r>
+        <w:t xml:space="preserve">these spikes. </w:t>
+      </w:r>
+    </w:p>
+    <w:p>
+      <w:r>
+        <w:drawing>
+          <wp:inline distT="0" distB="0" distL="0" distR="0" wp14:anchorId="545DC3FE" wp14:editId="16229E6A">
+            <wp:extent cx="5731510" cy="3546475"/>
+            <wp:effectExtent l="0" t="0" r="2540" b="0"/>
+            <wp:docPr id="1585437070" name="Picture 1"/>
+            <wp:cNvGraphicFramePr>
+              <a:graphicFrameLocks xmlns:a="http://schemas.openxmlformats.org/drawingml/2006/main" noChangeAspect="1"/>
+            </wp:cNvGraphicFramePr>
+            <a:graphic xmlns:a="http://schemas.openxmlformats.org/drawingml/2006/main">
+              <a:graphicData uri="http://schemas.openxmlformats.org/drawingml/2006/picture">
+                <pic:pic xmlns:pic="http://schemas.openxmlformats.org/drawingml/2006/picture">
+                  <pic:nvPicPr>
+                    <pic:cNvPr id="1585437070" name=""/>
+                    <pic:cNvPicPr/>
+                  </pic:nvPicPr>
+                  <pic:blipFill>
+                    <a:blip r:embed="rId15"/>
+                    <a:stretch>
+                      <a:fillRect/>
+                    </a:stretch>
+                  </pic:blipFill>
+                  <pic:spPr>
+                    <a:xfrm>
+                      <a:off x="0" y="0"/>
+                      <a:ext cx="5731510" cy="3546475"/>
+                    </a:xfrm>
+                    <a:prstGeom prst="rect">
+                      <a:avLst/>
+                    </a:prstGeom>
+                  </pic:spPr>
+                </pic:pic>
+              </a:graphicData>
+            </a:graphic>
+          </wp:inline>
+        </w:drawing>
+      </w:r>
+    </w:p>
     <w:p>
       <w:pPr>
         <w:pStyle w:val="Heading1"/>
       </w:pPr>
       <w:r>
+        <w:t>Conclusion</w:t>
+      </w:r>
+    </w:p>
+    <w:p/>
+    <w:p>
+      <w:pPr>
+        <w:pStyle w:val="Heading1"/>
+      </w:pPr>
+      <w:r>
         <w:t>Recommendations:</w:t>
       </w:r>
     </w:p>
     <w:p>
       <w:r>
-        <w:t xml:space="preserve">It is recommended that due to greater variablility and relationships and influence that more than one </w:t>
+        <w:t xml:space="preserve">It is recommended that due to greater </w:t>
+      </w:r>
+      <w:proofErr w:type="spellStart"/>
+      <w:r>
+        <w:t>variablility</w:t>
+      </w:r>
+      <w:proofErr w:type="spellEnd"/>
+      <w:r>
+        <w:t xml:space="preserve"> and relationships and influence that more than one </w:t>
       </w:r>
       <w:r>
         <w:t xml:space="preserve">variable has on </w:t>
       </w:r>
       <w:r>
-        <w:t>number of bicycles used, a multi dimensional regression or nureul network would be a better fit.</w:t>
+        <w:t xml:space="preserve">number of bicycles used, a </w:t>
+      </w:r>
+      <w:proofErr w:type="spellStart"/>
+      <w:r>
+        <w:t>multi dimensional</w:t>
+      </w:r>
+      <w:proofErr w:type="spellEnd"/>
+      <w:r>
+        <w:t xml:space="preserve"> regression or </w:t>
+      </w:r>
+      <w:proofErr w:type="spellStart"/>
+      <w:r>
+        <w:t>nureul</w:t>
+      </w:r>
+      <w:proofErr w:type="spellEnd"/>
+      <w:r>
+        <w:t xml:space="preserve"> network would be a better fit.</w:t>
       </w:r>
     </w:p>
     <w:sectPr>

</xml_diff>

<commit_message>
Started ML Lin Reg
</commit_message>
<xml_diff>
--- a/Assignment 2 - Draft_2.docx
+++ b/Assignment 2 - Draft_2.docx
@@ -891,6 +891,11 @@
         <w:t xml:space="preserve">has a standard deviation of 2016.87. This is very large swings in the data presented around the mean of 77.75. </w:t>
       </w:r>
     </w:p>
+    <w:p/>
+    <w:p/>
+    <w:p/>
+    <w:p/>
+    <w:p/>
     <w:p>
       <w:pPr>
         <w:pStyle w:val="Caption"/>
@@ -898,6 +903,7 @@
       </w:pPr>
       <w:bookmarkStart w:id="0" w:name="_Ref228343783"/>
       <w:r>
+        <w:lastRenderedPageBreak/>
         <w:t xml:space="preserve">Table </w:t>
       </w:r>
       <w:fldSimple w:instr=" SEQ Table \* ARABIC ">
@@ -1242,7 +1248,6 @@
           </w:tcPr>
           <w:p>
             <w:r>
-              <w:lastRenderedPageBreak/>
               <w:t>Humidity</w:t>
             </w:r>
           </w:p>
@@ -1740,21 +1745,7 @@
         <w:rPr>
           <w:rFonts w:ascii="Aptos" w:hAnsi="Aptos"/>
         </w:rPr>
-        <w:t>(</w:t>
-      </w:r>
-      <w:proofErr w:type="spellStart"/>
-      <w:r>
-        <w:rPr>
-          <w:rFonts w:ascii="Aptos" w:hAnsi="Aptos"/>
-        </w:rPr>
-        <w:t>GeeksforGeeks</w:t>
-      </w:r>
-      <w:proofErr w:type="spellEnd"/>
-      <w:r>
-        <w:rPr>
-          <w:rFonts w:ascii="Aptos" w:hAnsi="Aptos"/>
-        </w:rPr>
-        <w:t xml:space="preserve"> 2026)</w:t>
+        <w:t>(GeeksforGeeks 2026)</w:t>
       </w:r>
       <w:r>
         <w:fldChar w:fldCharType="end"/>
@@ -1768,6 +1759,7 @@
         <w:pStyle w:val="Heading1"/>
       </w:pPr>
       <w:r>
+        <w:lastRenderedPageBreak/>
         <w:t>Data Cleaning:</w:t>
       </w:r>
     </w:p>
@@ -1844,11 +1836,7 @@
         <w:t xml:space="preserve">might affect </w:t>
       </w:r>
       <w:r>
-        <w:t xml:space="preserve">some of the overall </w:t>
-      </w:r>
-      <w:r>
-        <w:lastRenderedPageBreak/>
-        <w:t xml:space="preserve">shape of the graph. Knowing </w:t>
+        <w:t xml:space="preserve">some of the overall shape of the graph. Knowing </w:t>
       </w:r>
       <w:r>
         <w:t xml:space="preserve">that each of the </w:t>
@@ -2488,6 +2476,14 @@
       </w:r>
     </w:p>
     <w:p>
+      <w:pPr>
+        <w:pStyle w:val="Heading2"/>
+      </w:pPr>
+      <w:r>
+        <w:t>Temperature and Seasonality:</w:t>
+      </w:r>
+    </w:p>
+    <w:p>
       <w:r>
         <w:t xml:space="preserve">Within </w:t>
       </w:r>
@@ -2531,30 +2527,6 @@
         <w:fldChar w:fldCharType="end"/>
       </w:r>
       <w:r>
-        <w:t xml:space="preserve"> and </w:t>
-      </w:r>
-      <w:r>
-        <w:fldChar w:fldCharType="begin"/>
-      </w:r>
-      <w:r>
-        <w:instrText xml:space="preserve"> REF _Ref228358712 \h </w:instrText>
-      </w:r>
-      <w:r>
-        <w:fldChar w:fldCharType="separate"/>
-      </w:r>
-      <w:r>
-        <w:t xml:space="preserve">Figure </w:t>
-      </w:r>
-      <w:r>
-        <w:rPr>
-          <w:noProof/>
-        </w:rPr>
-        <w:t>4</w:t>
-      </w:r>
-      <w:r>
-        <w:fldChar w:fldCharType="end"/>
-      </w:r>
-      <w:r>
         <w:t xml:space="preserve">, </w:t>
       </w:r>
       <w:r>
@@ -2612,7 +2584,11 @@
         <w:t xml:space="preserve"> bike rental numbers.</w:t>
       </w:r>
       <w:r>
-        <w:t xml:space="preserve"> With most people renting bicycles in summer and winter</w:t>
+        <w:t xml:space="preserve"> With most people renting bicycles in summer and </w:t>
+      </w:r>
+      <w:r>
+        <w:lastRenderedPageBreak/>
+        <w:t>winter</w:t>
       </w:r>
       <w:r>
         <w:t xml:space="preserve"> (</w:t>
@@ -2660,11 +2636,13 @@
         <w:jc w:val="center"/>
       </w:pPr>
       <w:r>
-        <w:lastRenderedPageBreak/>
+        <w:rPr>
+          <w:noProof/>
+        </w:rPr>
         <w:drawing>
-          <wp:inline distT="0" distB="0" distL="0" distR="0" wp14:anchorId="76EDB0C5" wp14:editId="589A6224">
-            <wp:extent cx="4067033" cy="3009496"/>
-            <wp:effectExtent l="0" t="0" r="0" b="635"/>
+          <wp:inline distT="0" distB="0" distL="0" distR="0" wp14:anchorId="76EDB0C5" wp14:editId="3B3F69D3">
+            <wp:extent cx="3555332" cy="2630851"/>
+            <wp:effectExtent l="0" t="0" r="7620" b="0"/>
             <wp:docPr id="234802912" name="Picture 1"/>
             <wp:cNvGraphicFramePr>
               <a:graphicFrameLocks xmlns:a="http://schemas.openxmlformats.org/drawingml/2006/main" noChangeAspect="1"/>
@@ -2685,7 +2663,7 @@
                   <pic:spPr>
                     <a:xfrm>
                       <a:off x="0" y="0"/>
-                      <a:ext cx="4072524" cy="3013559"/>
+                      <a:ext cx="3565091" cy="2638072"/>
                     </a:xfrm>
                     <a:prstGeom prst="rect">
                       <a:avLst/>
@@ -2734,6 +2712,14 @@
       </w:r>
     </w:p>
     <w:p>
+      <w:pPr>
+        <w:pStyle w:val="Heading3"/>
+      </w:pPr>
+      <w:r>
+        <w:t>Temperature and Weather:</w:t>
+      </w:r>
+    </w:p>
+    <w:p>
       <w:r>
         <w:t>The weather seems to have a larger effect on bike rentals (</w:t>
       </w:r>
@@ -2778,10 +2764,13 @@
         <w:jc w:val="center"/>
       </w:pPr>
       <w:r>
+        <w:rPr>
+          <w:noProof/>
+        </w:rPr>
         <w:drawing>
-          <wp:inline distT="0" distB="0" distL="0" distR="0" wp14:anchorId="2142C84C" wp14:editId="3443642A">
-            <wp:extent cx="4054718" cy="3019700"/>
-            <wp:effectExtent l="0" t="0" r="3175" b="9525"/>
+          <wp:inline distT="0" distB="0" distL="0" distR="0" wp14:anchorId="2142C84C" wp14:editId="74B0F4B5">
+            <wp:extent cx="3500896" cy="2607249"/>
+            <wp:effectExtent l="0" t="0" r="4445" b="3175"/>
             <wp:docPr id="1796451686" name="Picture 1"/>
             <wp:cNvGraphicFramePr>
               <a:graphicFrameLocks xmlns:a="http://schemas.openxmlformats.org/drawingml/2006/main" noChangeAspect="1"/>
@@ -2802,7 +2791,7 @@
                   <pic:spPr>
                     <a:xfrm>
                       <a:off x="0" y="0"/>
-                      <a:ext cx="4063930" cy="3026561"/>
+                      <a:ext cx="3517077" cy="2619300"/>
                     </a:xfrm>
                     <a:prstGeom prst="rect">
                       <a:avLst/>
@@ -2844,6 +2833,16 @@
         <w:t>Source – Author</w:t>
       </w:r>
     </w:p>
+    <w:p/>
+    <w:p>
+      <w:pPr>
+        <w:pStyle w:val="Heading3"/>
+      </w:pPr>
+      <w:r>
+        <w:lastRenderedPageBreak/>
+        <w:t>Time Series Analysis</w:t>
+      </w:r>
+    </w:p>
     <w:p>
       <w:r>
         <w:t xml:space="preserve">Over the summer holidays </w:t>
@@ -2855,11 +2854,7 @@
         <w:t xml:space="preserve"> there is large uptick in the number of bike rentals. This can be attributed to </w:t>
       </w:r>
       <w:r>
-        <w:t xml:space="preserve">a mixture of parents spending time with their </w:t>
-      </w:r>
-      <w:r>
-        <w:lastRenderedPageBreak/>
-        <w:t xml:space="preserve">children over Christmas and </w:t>
+        <w:t xml:space="preserve">a mixture of parents spending time with their children over Christmas and </w:t>
       </w:r>
       <w:r>
         <w:t xml:space="preserve">the children having the spare time over the school holidays. In conjunction with the generally </w:t>
@@ -2885,6 +2880,9 @@
     </w:p>
     <w:p>
       <w:r>
+        <w:rPr>
+          <w:noProof/>
+        </w:rPr>
         <w:drawing>
           <wp:inline distT="0" distB="0" distL="0" distR="0" wp14:anchorId="545DC3FE" wp14:editId="16229E6A">
             <wp:extent cx="5731510" cy="3546475"/>
@@ -2923,10 +2921,80 @@
       </w:r>
     </w:p>
     <w:p>
+      <w:r>
+        <w:t xml:space="preserve">To make the time series analysis a little smoother, a resampling of </w:t>
+      </w:r>
+      <w:r>
+        <w:t xml:space="preserve">a mean monthly value is chosen. This smooth out the data, showing clearer trends </w:t>
+      </w:r>
+      <w:r>
+        <w:t>monthly</w:t>
+      </w:r>
+      <w:r>
+        <w:t xml:space="preserve">. However, will loose accuracy in the </w:t>
+      </w:r>
+      <w:r>
+        <w:t>daily/weekly seasonality changes that occur during the month.</w:t>
+      </w:r>
+    </w:p>
+    <w:p>
       <w:pPr>
         <w:pStyle w:val="Heading1"/>
       </w:pPr>
       <w:r>
+        <w:t>Machine Learning</w:t>
+      </w:r>
+    </w:p>
+    <w:p>
+      <w:pPr>
+        <w:pStyle w:val="Heading2"/>
+      </w:pPr>
+      <w:r>
+        <w:t>Choosing a Model:</w:t>
+      </w:r>
+    </w:p>
+    <w:p>
+      <w:r>
+        <w:t xml:space="preserve">Here regression analysis was chosen. </w:t>
+      </w:r>
+      <w:r>
+        <w:t xml:space="preserve">This is due to the council wishing to predict a numerical outcome </w:t>
+      </w:r>
+      <w:r>
+        <w:t>(Number of bike rentals)</w:t>
+      </w:r>
+      <w:r>
+        <w:t xml:space="preserve">, and type of </w:t>
+      </w:r>
+      <w:r>
+        <w:t xml:space="preserve">training data. </w:t>
+      </w:r>
+      <w:r>
+        <w:t>The simplest type, Linear Regression, was chosen to do initial sampling.</w:t>
+      </w:r>
+    </w:p>
+    <w:p>
+      <w:pPr>
+        <w:pStyle w:val="Heading3"/>
+      </w:pPr>
+      <w:r>
+        <w:t>Checking Data:</w:t>
+      </w:r>
+    </w:p>
+    <w:p>
+      <w:r>
+        <w:t xml:space="preserve">It was found that during the model training period that there were a few values outside of acceptable date ranges, e.g. 29/04/2025. These values were dropped as </w:t>
+      </w:r>
+      <w:r>
+        <w:t>these values cannot exist within the real world.</w:t>
+      </w:r>
+    </w:p>
+    <w:p>
+      <w:pPr>
+        <w:pStyle w:val="Heading1"/>
+      </w:pPr>
+      <w:r>
+        <w:lastRenderedPageBreak/>
         <w:t>Conclusion</w:t>
       </w:r>
     </w:p>
@@ -2941,6 +3009,19 @@
     </w:p>
     <w:p>
       <w:r>
+        <w:t xml:space="preserve">Hard to predict around the </w:t>
+      </w:r>
+      <w:proofErr w:type="spellStart"/>
+      <w:r>
+        <w:t>seasonalilty</w:t>
+      </w:r>
+      <w:proofErr w:type="spellEnd"/>
+      <w:r>
+        <w:t xml:space="preserve"> of bicycle analysis.</w:t>
+      </w:r>
+    </w:p>
+    <w:p>
+      <w:r>
         <w:t xml:space="preserve">It is recommended that due to greater </w:t>
       </w:r>
       <w:proofErr w:type="spellStart"/>
@@ -2972,6 +3053,20 @@
       <w:proofErr w:type="spellEnd"/>
       <w:r>
         <w:t xml:space="preserve"> network would be a better fit.</w:t>
+      </w:r>
+      <w:r>
+        <w:t xml:space="preserve"> Use Something </w:t>
+      </w:r>
+      <w:r>
+        <w:t xml:space="preserve">like non-linear with high </w:t>
+      </w:r>
+      <w:proofErr w:type="spellStart"/>
+      <w:r>
+        <w:t>polynoamial</w:t>
+      </w:r>
+      <w:proofErr w:type="spellEnd"/>
+      <w:r>
+        <w:t xml:space="preserve"> degree Support Vector Regression</w:t>
       </w:r>
     </w:p>
     <w:sectPr>
@@ -3725,7 +3820,6 @@
     <w:next w:val="Normal"/>
     <w:link w:val="Heading3Char"/>
     <w:uiPriority w:val="9"/>
-    <w:semiHidden/>
     <w:unhideWhenUsed/>
     <w:qFormat/>
     <w:rsid w:val="00D91D44"/>
@@ -3877,6 +3971,7 @@
   <w:style w:type="character" w:default="1" w:styleId="DefaultParagraphFont">
     <w:name w:val="Default Paragraph Font"/>
     <w:uiPriority w:val="1"/>
+    <w:semiHidden/>
     <w:unhideWhenUsed/>
   </w:style>
   <w:style w:type="table" w:default="1" w:styleId="TableNormal">
@@ -3931,7 +4026,6 @@
     <w:basedOn w:val="DefaultParagraphFont"/>
     <w:link w:val="Heading3"/>
     <w:uiPriority w:val="9"/>
-    <w:semiHidden/>
     <w:rsid w:val="00D91D44"/>
     <w:rPr>
       <w:rFonts w:eastAsiaTheme="majorEastAsia" w:cstheme="majorBidi"/>

</xml_diff>

<commit_message>
Add Resampled Time series graph
</commit_message>
<xml_diff>
--- a/Assignment 2 - Draft_2.docx
+++ b/Assignment 2 - Draft_2.docx
@@ -2739,7 +2739,16 @@
         <w:fldChar w:fldCharType="end"/>
       </w:r>
       <w:r>
-        <w:t>). With when rain or high chance of imminent rain is coming bike rental numbers drop.</w:t>
+        <w:t>). With when rain or high chance of imminent rain is coming bike rental numbers drop</w:t>
+      </w:r>
+      <w:r>
+        <w:t xml:space="preserve"> </w:t>
+      </w:r>
+      <w:r>
+        <w:t>comparatively</w:t>
+      </w:r>
+      <w:r>
+        <w:t>.</w:t>
       </w:r>
       <w:r>
         <w:t xml:space="preserve"> However</w:t>
@@ -2748,7 +2757,10 @@
         <w:t xml:space="preserve">, in the overall trends </w:t>
       </w:r>
       <w:r>
-        <w:t>weather is not that much of an impact.</w:t>
+        <w:t>weather is not that much of an impact</w:t>
+      </w:r>
+      <w:r>
+        <w:t xml:space="preserve"> when the temperature has a much larger impact.</w:t>
       </w:r>
     </w:p>
     <w:p/>
@@ -2833,7 +2845,6 @@
         <w:pStyle w:val="Heading3"/>
       </w:pPr>
       <w:r>
-        <w:lastRenderedPageBreak/>
         <w:t>Time Series Analysis</w:t>
       </w:r>
     </w:p>
@@ -2925,11 +2936,60 @@
         <w:t>monthly</w:t>
       </w:r>
       <w:r>
-        <w:t xml:space="preserve">. However, will loose accuracy in the </w:t>
+        <w:t xml:space="preserve">. However, will </w:t>
+      </w:r>
+      <w:r>
+        <w:t>lose</w:t>
+      </w:r>
+      <w:r>
+        <w:t xml:space="preserve"> accuracy in the </w:t>
       </w:r>
       <w:r>
         <w:t>daily/weekly seasonality changes that occur during the month.</w:t>
       </w:r>
+      <w:r>
+        <w:t xml:space="preserve"> In addition it lost some of the daily outlier spikes, e.g. FIG A January spikes ~1350 whereas FIG B spikes ~950.</w:t>
+      </w:r>
+    </w:p>
+    <w:p>
+      <w:r>
+        <w:lastRenderedPageBreak/>
+        <w:drawing>
+          <wp:inline distT="0" distB="0" distL="0" distR="0" wp14:anchorId="5855330E" wp14:editId="7130383C">
+            <wp:extent cx="5093908" cy="2677886"/>
+            <wp:effectExtent l="0" t="0" r="0" b="8255"/>
+            <wp:docPr id="1075502313" name="Picture 1"/>
+            <wp:cNvGraphicFramePr>
+              <a:graphicFrameLocks xmlns:a="http://schemas.openxmlformats.org/drawingml/2006/main" noChangeAspect="1"/>
+            </wp:cNvGraphicFramePr>
+            <a:graphic xmlns:a="http://schemas.openxmlformats.org/drawingml/2006/main">
+              <a:graphicData uri="http://schemas.openxmlformats.org/drawingml/2006/picture">
+                <pic:pic xmlns:pic="http://schemas.openxmlformats.org/drawingml/2006/picture">
+                  <pic:nvPicPr>
+                    <pic:cNvPr id="1075502313" name=""/>
+                    <pic:cNvPicPr/>
+                  </pic:nvPicPr>
+                  <pic:blipFill>
+                    <a:blip r:embed="rId16"/>
+                    <a:stretch>
+                      <a:fillRect/>
+                    </a:stretch>
+                  </pic:blipFill>
+                  <pic:spPr>
+                    <a:xfrm>
+                      <a:off x="0" y="0"/>
+                      <a:ext cx="5106770" cy="2684648"/>
+                    </a:xfrm>
+                    <a:prstGeom prst="rect">
+                      <a:avLst/>
+                    </a:prstGeom>
+                  </pic:spPr>
+                </pic:pic>
+              </a:graphicData>
+            </a:graphic>
+          </wp:inline>
+        </w:drawing>
+      </w:r>
     </w:p>
     <w:p>
       <w:pPr>
@@ -2989,11 +3049,7 @@
         <w:t xml:space="preserve">In the end the “date” column had </w:t>
       </w:r>
       <w:r>
-        <w:t xml:space="preserve">to be dropped as </w:t>
-      </w:r>
-      <w:r>
-        <w:lastRenderedPageBreak/>
-        <w:t xml:space="preserve">the linear regression algorithm present within SciKit-Learn </w:t>
+        <w:t xml:space="preserve">to be dropped as the linear regression algorithm present within SciKit-Learn </w:t>
       </w:r>
       <w:r>
         <w:t xml:space="preserve">cannot take timestamp </w:t>
@@ -3126,6 +3182,7 @@
           </w:rPr>
           <m:t>/</m:t>
         </m:r>
+        <w:commentRangeStart w:id="5"/>
         <m:r>
           <w:rPr>
             <w:rFonts w:ascii="Cambria Math" w:eastAsiaTheme="minorEastAsia" w:hAnsi="Cambria Math"/>
@@ -3271,7 +3328,32 @@
         <w:rPr>
           <w:rFonts w:eastAsiaTheme="minorEastAsia"/>
         </w:rPr>
-        <w:t xml:space="preserve">. </w:t>
+        <w:t>.</w:t>
+      </w:r>
+      <w:commentRangeEnd w:id="5"/>
+      <w:r>
+        <w:rPr>
+          <w:rStyle w:val="CommentReference"/>
+          <w:rFonts w:eastAsiaTheme="minorEastAsia"/>
+          <w:sz w:val="24"/>
+          <w:szCs w:val="24"/>
+        </w:rPr>
+        <w:commentReference w:id="5"/>
+      </w:r>
+    </w:p>
+    <w:p>
+      <w:pPr>
+        <w:pStyle w:val="Heading2"/>
+        <w:rPr>
+          <w:rFonts w:eastAsiaTheme="minorEastAsia"/>
+        </w:rPr>
+      </w:pPr>
+      <w:r>
+        <w:rPr>
+          <w:rFonts w:eastAsiaTheme="minorEastAsia"/>
+        </w:rPr>
+        <w:lastRenderedPageBreak/>
+        <w:t>Making Predictions:</w:t>
       </w:r>
     </w:p>
     <w:p>
@@ -3322,6 +3404,45 @@
     </w:sectPr>
   </w:body>
 </w:document>
+</file>
+
+<file path=word/comments.xml><?xml version="1.0" encoding="utf-8"?>
+<w:comments xmlns:wpc="http://schemas.microsoft.com/office/word/2010/wordprocessingCanvas" xmlns:cx="http://schemas.microsoft.com/office/drawing/2014/chartex" xmlns:cx1="http://schemas.microsoft.com/office/drawing/2015/9/8/chartex" xmlns:cx2="http://schemas.microsoft.com/office/drawing/2015/10/21/chartex" xmlns:cx3="http://schemas.microsoft.com/office/drawing/2016/5/9/chartex" xmlns:cx4="http://schemas.microsoft.com/office/drawing/2016/5/10/chartex" xmlns:cx5="http://schemas.microsoft.com/office/drawing/2016/5/11/chartex" xmlns:cx6="http://schemas.microsoft.com/office/drawing/2016/5/12/chartex" xmlns:cx7="http://schemas.microsoft.com/office/drawing/2016/5/13/chartex" xmlns:cx8="http://schemas.microsoft.com/office/drawing/2016/5/14/chartex" xmlns:mc="http://schemas.openxmlformats.org/markup-compatibility/2006" xmlns:aink="http://schemas.microsoft.com/office/drawing/2016/ink" xmlns:am3d="http://schemas.microsoft.com/office/drawing/2017/model3d" xmlns:o="urn:schemas-microsoft-com:office:office" xmlns:oel="http://schemas.microsoft.com/office/2019/extlst" xmlns:r="http://schemas.openxmlformats.org/officeDocument/2006/relationships" xmlns:m="http://schemas.openxmlformats.org/officeDocument/2006/math" xmlns:v="urn:schemas-microsoft-com:vml" xmlns:wp14="http://schemas.microsoft.com/office/word/2010/wordprocessingDrawing" xmlns:wp="http://schemas.openxmlformats.org/drawingml/2006/wordprocessingDrawing" xmlns:w10="urn:schemas-microsoft-com:office:word" xmlns:w="http://schemas.openxmlformats.org/wordprocessingml/2006/main" xmlns:w14="http://schemas.microsoft.com/office/word/2010/wordml" xmlns:w15="http://schemas.microsoft.com/office/word/2012/wordml" xmlns:w16cex="http://schemas.microsoft.com/office/word/2018/wordml/cex" xmlns:w16cid="http://schemas.microsoft.com/office/word/2016/wordml/cid" xmlns:w16="http://schemas.microsoft.com/office/word/2018/wordml" xmlns:w16du="http://schemas.microsoft.com/office/word/2023/wordml/word16du" xmlns:w16sdtdh="http://schemas.microsoft.com/office/word/2020/wordml/sdtdatahash" xmlns:w16sdtfl="http://schemas.microsoft.com/office/word/2024/wordml/sdtformatlock" xmlns:w16se="http://schemas.microsoft.com/office/word/2015/wordml/symex" xmlns:wpg="http://schemas.microsoft.com/office/word/2010/wordprocessingGroup" xmlns:wpi="http://schemas.microsoft.com/office/word/2010/wordprocessingInk" xmlns:wne="http://schemas.microsoft.com/office/word/2006/wordml" xmlns:wps="http://schemas.microsoft.com/office/word/2010/wordprocessingShape" mc:Ignorable="w14 w15 w16se w16cid w16 w16cex w16sdtdh w16sdtfl w16du wp14">
+  <w:comment w:id="5" w:author="Lachlan Wyer" w:date="2026-05-08T08:19:00Z" w:initials="LW">
+    <w:p>
+      <w:pPr>
+        <w:pStyle w:val="CommentText"/>
+      </w:pPr>
+      <w:r>
+        <w:rPr>
+          <w:rStyle w:val="CommentReference"/>
+        </w:rPr>
+        <w:annotationRef/>
+      </w:r>
+      <w:r>
+        <w:t>Do more evaulation of the model? Under/over-fitting, training further predictions</w:t>
+      </w:r>
+    </w:p>
+  </w:comment>
+</w:comments>
+</file>
+
+<file path=word/commentsExtended.xml><?xml version="1.0" encoding="utf-8"?>
+<w15:commentsEx xmlns:wpc="http://schemas.microsoft.com/office/word/2010/wordprocessingCanvas" xmlns:cx="http://schemas.microsoft.com/office/drawing/2014/chartex" xmlns:cx1="http://schemas.microsoft.com/office/drawing/2015/9/8/chartex" xmlns:cx2="http://schemas.microsoft.com/office/drawing/2015/10/21/chartex" xmlns:cx3="http://schemas.microsoft.com/office/drawing/2016/5/9/chartex" xmlns:cx4="http://schemas.microsoft.com/office/drawing/2016/5/10/chartex" xmlns:cx5="http://schemas.microsoft.com/office/drawing/2016/5/11/chartex" xmlns:cx6="http://schemas.microsoft.com/office/drawing/2016/5/12/chartex" xmlns:cx7="http://schemas.microsoft.com/office/drawing/2016/5/13/chartex" xmlns:cx8="http://schemas.microsoft.com/office/drawing/2016/5/14/chartex" xmlns:mc="http://schemas.openxmlformats.org/markup-compatibility/2006" xmlns:aink="http://schemas.microsoft.com/office/drawing/2016/ink" xmlns:am3d="http://schemas.microsoft.com/office/drawing/2017/model3d" xmlns:o="urn:schemas-microsoft-com:office:office" xmlns:oel="http://schemas.microsoft.com/office/2019/extlst" xmlns:r="http://schemas.openxmlformats.org/officeDocument/2006/relationships" xmlns:m="http://schemas.openxmlformats.org/officeDocument/2006/math" xmlns:v="urn:schemas-microsoft-com:vml" xmlns:wp14="http://schemas.microsoft.com/office/word/2010/wordprocessingDrawing" xmlns:wp="http://schemas.openxmlformats.org/drawingml/2006/wordprocessingDrawing" xmlns:w10="urn:schemas-microsoft-com:office:word" xmlns:w="http://schemas.openxmlformats.org/wordprocessingml/2006/main" xmlns:w14="http://schemas.microsoft.com/office/word/2010/wordml" xmlns:w15="http://schemas.microsoft.com/office/word/2012/wordml" xmlns:w16cex="http://schemas.microsoft.com/office/word/2018/wordml/cex" xmlns:w16cid="http://schemas.microsoft.com/office/word/2016/wordml/cid" xmlns:w16="http://schemas.microsoft.com/office/word/2018/wordml" xmlns:w16du="http://schemas.microsoft.com/office/word/2023/wordml/word16du" xmlns:w16sdtdh="http://schemas.microsoft.com/office/word/2020/wordml/sdtdatahash" xmlns:w16sdtfl="http://schemas.microsoft.com/office/word/2024/wordml/sdtformatlock" xmlns:w16se="http://schemas.microsoft.com/office/word/2015/wordml/symex" xmlns:wpg="http://schemas.microsoft.com/office/word/2010/wordprocessingGroup" xmlns:wpi="http://schemas.microsoft.com/office/word/2010/wordprocessingInk" xmlns:wne="http://schemas.microsoft.com/office/word/2006/wordml" xmlns:wps="http://schemas.microsoft.com/office/word/2010/wordprocessingShape" mc:Ignorable="w14 w15 w16se w16cid w16 w16cex w16sdtdh w16sdtfl w16du wp14">
+  <w15:commentEx w15:paraId="0699A2FE" w15:done="0"/>
+</w15:commentsEx>
+</file>
+
+<file path=word/commentsExtensible.xml><?xml version="1.0" encoding="utf-8"?>
+<w16cex:commentsExtensible xmlns:wpc="http://schemas.microsoft.com/office/word/2010/wordprocessingCanvas" xmlns:cx="http://schemas.microsoft.com/office/drawing/2014/chartex" xmlns:cx1="http://schemas.microsoft.com/office/drawing/2015/9/8/chartex" xmlns:cx2="http://schemas.microsoft.com/office/drawing/2015/10/21/chartex" xmlns:cx3="http://schemas.microsoft.com/office/drawing/2016/5/9/chartex" xmlns:cx4="http://schemas.microsoft.com/office/drawing/2016/5/10/chartex" xmlns:cx5="http://schemas.microsoft.com/office/drawing/2016/5/11/chartex" xmlns:cx6="http://schemas.microsoft.com/office/drawing/2016/5/12/chartex" xmlns:cx7="http://schemas.microsoft.com/office/drawing/2016/5/13/chartex" xmlns:cx8="http://schemas.microsoft.com/office/drawing/2016/5/14/chartex" xmlns:cr="http://schemas.microsoft.com/office/comments/2020/reactions" xmlns:mc="http://schemas.openxmlformats.org/markup-compatibility/2006" xmlns:aink="http://schemas.microsoft.com/office/drawing/2016/ink" xmlns:am3d="http://schemas.microsoft.com/office/drawing/2017/model3d" xmlns:o="urn:schemas-microsoft-com:office:office" xmlns:oel="http://schemas.microsoft.com/office/2019/extlst" xmlns:r="http://schemas.openxmlformats.org/officeDocument/2006/relationships" xmlns:m="http://schemas.openxmlformats.org/officeDocument/2006/math" xmlns:v="urn:schemas-microsoft-com:vml" xmlns:wp14="http://schemas.microsoft.com/office/word/2010/wordprocessingDrawing" xmlns:wp="http://schemas.openxmlformats.org/drawingml/2006/wordprocessingDrawing" xmlns:w10="urn:schemas-microsoft-com:office:word" xmlns:w="http://schemas.openxmlformats.org/wordprocessingml/2006/main" xmlns:w14="http://schemas.microsoft.com/office/word/2010/wordml" xmlns:w15="http://schemas.microsoft.com/office/word/2012/wordml" xmlns:w16cex="http://schemas.microsoft.com/office/word/2018/wordml/cex" xmlns:w16cid="http://schemas.microsoft.com/office/word/2016/wordml/cid" xmlns:w16="http://schemas.microsoft.com/office/word/2018/wordml" xmlns:w16du="http://schemas.microsoft.com/office/word/2023/wordml/word16du" xmlns:w16sdtdh="http://schemas.microsoft.com/office/word/2020/wordml/sdtdatahash" xmlns:w16sdtfl="http://schemas.microsoft.com/office/word/2024/wordml/sdtformatlock" xmlns:w16se="http://schemas.microsoft.com/office/word/2015/wordml/symex" xmlns:wpg="http://schemas.microsoft.com/office/word/2010/wordprocessingGroup" xmlns:wpi="http://schemas.microsoft.com/office/word/2010/wordprocessingInk" xmlns:wne="http://schemas.microsoft.com/office/word/2006/wordml" xmlns:wps="http://schemas.microsoft.com/office/word/2010/wordprocessingShape" mc:Ignorable="w14 w15 w16se w16cid w16 w16cex w16sdtdh w16sdtfl cr w16du wp14">
+  <w16cex:commentExtensible w16cex:durableId="04610A52" w16cex:dateUtc="2026-05-07T22:19:00Z"/>
+</w16cex:commentsExtensible>
+</file>
+
+<file path=word/commentsIds.xml><?xml version="1.0" encoding="utf-8"?>
+<w16cid:commentsIds xmlns:wpc="http://schemas.microsoft.com/office/word/2010/wordprocessingCanvas" xmlns:cx="http://schemas.microsoft.com/office/drawing/2014/chartex" xmlns:cx1="http://schemas.microsoft.com/office/drawing/2015/9/8/chartex" xmlns:cx2="http://schemas.microsoft.com/office/drawing/2015/10/21/chartex" xmlns:cx3="http://schemas.microsoft.com/office/drawing/2016/5/9/chartex" xmlns:cx4="http://schemas.microsoft.com/office/drawing/2016/5/10/chartex" xmlns:cx5="http://schemas.microsoft.com/office/drawing/2016/5/11/chartex" xmlns:cx6="http://schemas.microsoft.com/office/drawing/2016/5/12/chartex" xmlns:cx7="http://schemas.microsoft.com/office/drawing/2016/5/13/chartex" xmlns:cx8="http://schemas.microsoft.com/office/drawing/2016/5/14/chartex" xmlns:mc="http://schemas.openxmlformats.org/markup-compatibility/2006" xmlns:aink="http://schemas.microsoft.com/office/drawing/2016/ink" xmlns:am3d="http://schemas.microsoft.com/office/drawing/2017/model3d" xmlns:o="urn:schemas-microsoft-com:office:office" xmlns:oel="http://schemas.microsoft.com/office/2019/extlst" xmlns:r="http://schemas.openxmlformats.org/officeDocument/2006/relationships" xmlns:m="http://schemas.openxmlformats.org/officeDocument/2006/math" xmlns:v="urn:schemas-microsoft-com:vml" xmlns:wp14="http://schemas.microsoft.com/office/word/2010/wordprocessingDrawing" xmlns:wp="http://schemas.openxmlformats.org/drawingml/2006/wordprocessingDrawing" xmlns:w10="urn:schemas-microsoft-com:office:word" xmlns:w="http://schemas.openxmlformats.org/wordprocessingml/2006/main" xmlns:w14="http://schemas.microsoft.com/office/word/2010/wordml" xmlns:w15="http://schemas.microsoft.com/office/word/2012/wordml" xmlns:w16cex="http://schemas.microsoft.com/office/word/2018/wordml/cex" xmlns:w16cid="http://schemas.microsoft.com/office/word/2016/wordml/cid" xmlns:w16="http://schemas.microsoft.com/office/word/2018/wordml" xmlns:w16du="http://schemas.microsoft.com/office/word/2023/wordml/word16du" xmlns:w16sdtdh="http://schemas.microsoft.com/office/word/2020/wordml/sdtdatahash" xmlns:w16sdtfl="http://schemas.microsoft.com/office/word/2024/wordml/sdtformatlock" xmlns:w16se="http://schemas.microsoft.com/office/word/2015/wordml/symex" xmlns:wpg="http://schemas.microsoft.com/office/word/2010/wordprocessingGroup" xmlns:wpi="http://schemas.microsoft.com/office/word/2010/wordprocessingInk" xmlns:wne="http://schemas.microsoft.com/office/word/2006/wordml" xmlns:wps="http://schemas.microsoft.com/office/word/2010/wordprocessingShape" mc:Ignorable="w14 w15 w16se w16cid w16 w16cex w16sdtdh w16sdtfl w16du wp14">
+  <w16cid:commentId w16cid:paraId="0699A2FE" w16cid:durableId="04610A52"/>
+</w16cid:commentsIds>
 </file>
 
 <file path=word/endnotes.xml><?xml version="1.0" encoding="utf-8"?>
@@ -3611,6 +3732,14 @@
     <w:abstractNumId w:val="0"/>
   </w:num>
 </w:numbering>
+</file>
+
+<file path=word/people.xml><?xml version="1.0" encoding="utf-8"?>
+<w15:people xmlns:wpc="http://schemas.microsoft.com/office/word/2010/wordprocessingCanvas" xmlns:cx="http://schemas.microsoft.com/office/drawing/2014/chartex" xmlns:cx1="http://schemas.microsoft.com/office/drawing/2015/9/8/chartex" xmlns:cx2="http://schemas.microsoft.com/office/drawing/2015/10/21/chartex" xmlns:cx3="http://schemas.microsoft.com/office/drawing/2016/5/9/chartex" xmlns:cx4="http://schemas.microsoft.com/office/drawing/2016/5/10/chartex" xmlns:cx5="http://schemas.microsoft.com/office/drawing/2016/5/11/chartex" xmlns:cx6="http://schemas.microsoft.com/office/drawing/2016/5/12/chartex" xmlns:cx7="http://schemas.microsoft.com/office/drawing/2016/5/13/chartex" xmlns:cx8="http://schemas.microsoft.com/office/drawing/2016/5/14/chartex" xmlns:mc="http://schemas.openxmlformats.org/markup-compatibility/2006" xmlns:aink="http://schemas.microsoft.com/office/drawing/2016/ink" xmlns:am3d="http://schemas.microsoft.com/office/drawing/2017/model3d" xmlns:o="urn:schemas-microsoft-com:office:office" xmlns:oel="http://schemas.microsoft.com/office/2019/extlst" xmlns:r="http://schemas.openxmlformats.org/officeDocument/2006/relationships" xmlns:m="http://schemas.openxmlformats.org/officeDocument/2006/math" xmlns:v="urn:schemas-microsoft-com:vml" xmlns:wp14="http://schemas.microsoft.com/office/word/2010/wordprocessingDrawing" xmlns:wp="http://schemas.openxmlformats.org/drawingml/2006/wordprocessingDrawing" xmlns:w10="urn:schemas-microsoft-com:office:word" xmlns:w="http://schemas.openxmlformats.org/wordprocessingml/2006/main" xmlns:w14="http://schemas.microsoft.com/office/word/2010/wordml" xmlns:w15="http://schemas.microsoft.com/office/word/2012/wordml" xmlns:w16cex="http://schemas.microsoft.com/office/word/2018/wordml/cex" xmlns:w16cid="http://schemas.microsoft.com/office/word/2016/wordml/cid" xmlns:w16="http://schemas.microsoft.com/office/word/2018/wordml" xmlns:w16du="http://schemas.microsoft.com/office/word/2023/wordml/word16du" xmlns:w16sdtdh="http://schemas.microsoft.com/office/word/2020/wordml/sdtdatahash" xmlns:w16sdtfl="http://schemas.microsoft.com/office/word/2024/wordml/sdtformatlock" xmlns:w16se="http://schemas.microsoft.com/office/word/2015/wordml/symex" xmlns:wpg="http://schemas.microsoft.com/office/word/2010/wordprocessingGroup" xmlns:wpi="http://schemas.microsoft.com/office/word/2010/wordprocessingInk" xmlns:wne="http://schemas.microsoft.com/office/word/2006/wordml" xmlns:wps="http://schemas.microsoft.com/office/word/2010/wordprocessingShape" mc:Ignorable="w14 w15 w16se w16cid w16 w16cex w16sdtdh w16sdtfl w16du wp14">
+  <w15:person w15:author="Lachlan Wyer">
+    <w15:presenceInfo w15:providerId="AD" w15:userId="S::lachlan.wyer@cqumail.com::3173a9f1-b9fb-4d08-92dd-14118bb596d9"/>
+  </w15:person>
+</w15:people>
 </file>
 
 <file path=word/styles.xml><?xml version="1.0" encoding="utf-8"?>
@@ -4651,6 +4780,72 @@
       <w:color w:val="666666"/>
     </w:rPr>
   </w:style>
+  <w:style w:type="character" w:styleId="CommentReference">
+    <w:name w:val="annotation reference"/>
+    <w:basedOn w:val="DefaultParagraphFont"/>
+    <w:uiPriority w:val="99"/>
+    <w:semiHidden/>
+    <w:unhideWhenUsed/>
+    <w:rsid w:val="004216AC"/>
+    <w:rPr>
+      <w:sz w:val="16"/>
+      <w:szCs w:val="16"/>
+    </w:rPr>
+  </w:style>
+  <w:style w:type="paragraph" w:styleId="CommentText">
+    <w:name w:val="annotation text"/>
+    <w:basedOn w:val="Normal"/>
+    <w:link w:val="CommentTextChar"/>
+    <w:uiPriority w:val="99"/>
+    <w:unhideWhenUsed/>
+    <w:rsid w:val="004216AC"/>
+    <w:pPr>
+      <w:spacing w:line="240" w:lineRule="auto"/>
+    </w:pPr>
+    <w:rPr>
+      <w:sz w:val="20"/>
+      <w:szCs w:val="20"/>
+    </w:rPr>
+  </w:style>
+  <w:style w:type="character" w:customStyle="1" w:styleId="CommentTextChar">
+    <w:name w:val="Comment Text Char"/>
+    <w:basedOn w:val="DefaultParagraphFont"/>
+    <w:link w:val="CommentText"/>
+    <w:uiPriority w:val="99"/>
+    <w:rsid w:val="004216AC"/>
+    <w:rPr>
+      <w:sz w:val="20"/>
+      <w:szCs w:val="20"/>
+    </w:rPr>
+  </w:style>
+  <w:style w:type="paragraph" w:styleId="CommentSubject">
+    <w:name w:val="annotation subject"/>
+    <w:basedOn w:val="CommentText"/>
+    <w:next w:val="CommentText"/>
+    <w:link w:val="CommentSubjectChar"/>
+    <w:uiPriority w:val="99"/>
+    <w:semiHidden/>
+    <w:unhideWhenUsed/>
+    <w:rsid w:val="004216AC"/>
+    <w:rPr>
+      <w:b/>
+      <w:bCs/>
+    </w:rPr>
+  </w:style>
+  <w:style w:type="character" w:customStyle="1" w:styleId="CommentSubjectChar">
+    <w:name w:val="Comment Subject Char"/>
+    <w:basedOn w:val="CommentTextChar"/>
+    <w:link w:val="CommentSubject"/>
+    <w:uiPriority w:val="99"/>
+    <w:semiHidden/>
+    <w:rsid w:val="004216AC"/>
+    <w:rPr>
+      <w:b/>
+      <w:bCs/>
+      <w:sz w:val="20"/>
+      <w:szCs w:val="20"/>
+    </w:rPr>
+  </w:style>
 </w:styles>
 </file>
 

</xml_diff>

<commit_message>
Convert Camel to Snake Case
</commit_message>
<xml_diff>
--- a/Assignment 2 - Draft_2.docx
+++ b/Assignment 2 - Draft_2.docx
@@ -3049,10 +3049,26 @@
         <w:t xml:space="preserve">In the end the “date” column had </w:t>
       </w:r>
       <w:r>
-        <w:t xml:space="preserve">to be dropped as the linear regression algorithm present within SciKit-Learn </w:t>
-      </w:r>
-      <w:r>
-        <w:t xml:space="preserve">cannot take timestamp </w:t>
+        <w:t xml:space="preserve">to be dropped as the linear regression algorithm present </w:t>
+      </w:r>
+      <w:commentRangeStart w:id="5"/>
+      <w:r>
+        <w:t xml:space="preserve">within SciKit-Learn </w:t>
+      </w:r>
+      <w:r>
+        <w:t>cannot take</w:t>
+      </w:r>
+      <w:commentRangeEnd w:id="5"/>
+      <w:r>
+        <w:rPr>
+          <w:rStyle w:val="CommentReference"/>
+          <w:sz w:val="24"/>
+          <w:szCs w:val="24"/>
+        </w:rPr>
+        <w:commentReference w:id="5"/>
+      </w:r>
+      <w:r>
+        <w:t xml:space="preserve"> timestamp </w:t>
       </w:r>
       <w:r>
         <w:t>datatype</w:t>
@@ -3182,7 +3198,7 @@
           </w:rPr>
           <m:t>/</m:t>
         </m:r>
-        <w:commentRangeStart w:id="5"/>
+        <w:commentRangeStart w:id="6"/>
         <m:r>
           <w:rPr>
             <w:rFonts w:ascii="Cambria Math" w:eastAsiaTheme="minorEastAsia" w:hAnsi="Cambria Math"/>
@@ -3330,7 +3346,7 @@
         </w:rPr>
         <w:t>.</w:t>
       </w:r>
-      <w:commentRangeEnd w:id="5"/>
+      <w:commentRangeEnd w:id="6"/>
       <w:r>
         <w:rPr>
           <w:rStyle w:val="CommentReference"/>
@@ -3338,7 +3354,56 @@
           <w:sz w:val="24"/>
           <w:szCs w:val="24"/>
         </w:rPr>
-        <w:commentReference w:id="5"/>
+        <w:commentReference w:id="6"/>
+      </w:r>
+      <w:r>
+        <w:rPr>
+          <w:rFonts w:eastAsiaTheme="minorEastAsia"/>
+        </w:rPr>
+        <w:t xml:space="preserve"> </w:t>
+      </w:r>
+      <w:r>
+        <w:rPr>
+          <w:rFonts w:eastAsiaTheme="minorEastAsia"/>
+        </w:rPr>
+        <w:t xml:space="preserve">That value is corroborated by simply looking at the variety </w:t>
+      </w:r>
+      <w:r>
+        <w:rPr>
+          <w:rFonts w:eastAsiaTheme="minorEastAsia"/>
+        </w:rPr>
+        <w:t>(non-linear) expression of the exploratory data analytics graph</w:t>
+      </w:r>
+      <w:r>
+        <w:rPr>
+          <w:rFonts w:eastAsiaTheme="minorEastAsia"/>
+        </w:rPr>
+        <w:t xml:space="preserve">s. I.E temperature/season/weather </w:t>
+      </w:r>
+      <w:r>
+        <w:rPr>
+          <w:rFonts w:eastAsiaTheme="minorEastAsia"/>
+        </w:rPr>
+        <w:t xml:space="preserve">against the count and time series graph. As such a linear </w:t>
+      </w:r>
+      <w:r>
+        <w:rPr>
+          <w:rFonts w:eastAsiaTheme="minorEastAsia"/>
+        </w:rPr>
+        <w:lastRenderedPageBreak/>
+        <w:t xml:space="preserve">regression model is not style of basic machine learning </w:t>
+      </w:r>
+      <w:r>
+        <w:rPr>
+          <w:rFonts w:eastAsiaTheme="minorEastAsia"/>
+        </w:rPr>
+        <w:t xml:space="preserve">required in the non-linear style </w:t>
+      </w:r>
+      <w:r>
+        <w:rPr>
+          <w:rFonts w:eastAsiaTheme="minorEastAsia"/>
+        </w:rPr>
+        <w:t>expressed within the data.</w:t>
       </w:r>
     </w:p>
     <w:p>
@@ -3352,7 +3417,6 @@
         <w:rPr>
           <w:rFonts w:eastAsiaTheme="minorEastAsia"/>
         </w:rPr>
-        <w:lastRenderedPageBreak/>
         <w:t>Making Predictions:</w:t>
       </w:r>
     </w:p>
@@ -3408,7 +3472,23 @@
 
 <file path=word/comments.xml><?xml version="1.0" encoding="utf-8"?>
 <w:comments xmlns:wpc="http://schemas.microsoft.com/office/word/2010/wordprocessingCanvas" xmlns:cx="http://schemas.microsoft.com/office/drawing/2014/chartex" xmlns:cx1="http://schemas.microsoft.com/office/drawing/2015/9/8/chartex" xmlns:cx2="http://schemas.microsoft.com/office/drawing/2015/10/21/chartex" xmlns:cx3="http://schemas.microsoft.com/office/drawing/2016/5/9/chartex" xmlns:cx4="http://schemas.microsoft.com/office/drawing/2016/5/10/chartex" xmlns:cx5="http://schemas.microsoft.com/office/drawing/2016/5/11/chartex" xmlns:cx6="http://schemas.microsoft.com/office/drawing/2016/5/12/chartex" xmlns:cx7="http://schemas.microsoft.com/office/drawing/2016/5/13/chartex" xmlns:cx8="http://schemas.microsoft.com/office/drawing/2016/5/14/chartex" xmlns:mc="http://schemas.openxmlformats.org/markup-compatibility/2006" xmlns:aink="http://schemas.microsoft.com/office/drawing/2016/ink" xmlns:am3d="http://schemas.microsoft.com/office/drawing/2017/model3d" xmlns:o="urn:schemas-microsoft-com:office:office" xmlns:oel="http://schemas.microsoft.com/office/2019/extlst" xmlns:r="http://schemas.openxmlformats.org/officeDocument/2006/relationships" xmlns:m="http://schemas.openxmlformats.org/officeDocument/2006/math" xmlns:v="urn:schemas-microsoft-com:vml" xmlns:wp14="http://schemas.microsoft.com/office/word/2010/wordprocessingDrawing" xmlns:wp="http://schemas.openxmlformats.org/drawingml/2006/wordprocessingDrawing" xmlns:w10="urn:schemas-microsoft-com:office:word" xmlns:w="http://schemas.openxmlformats.org/wordprocessingml/2006/main" xmlns:w14="http://schemas.microsoft.com/office/word/2010/wordml" xmlns:w15="http://schemas.microsoft.com/office/word/2012/wordml" xmlns:w16cex="http://schemas.microsoft.com/office/word/2018/wordml/cex" xmlns:w16cid="http://schemas.microsoft.com/office/word/2016/wordml/cid" xmlns:w16="http://schemas.microsoft.com/office/word/2018/wordml" xmlns:w16du="http://schemas.microsoft.com/office/word/2023/wordml/word16du" xmlns:w16sdtdh="http://schemas.microsoft.com/office/word/2020/wordml/sdtdatahash" xmlns:w16sdtfl="http://schemas.microsoft.com/office/word/2024/wordml/sdtformatlock" xmlns:w16se="http://schemas.microsoft.com/office/word/2015/wordml/symex" xmlns:wpg="http://schemas.microsoft.com/office/word/2010/wordprocessingGroup" xmlns:wpi="http://schemas.microsoft.com/office/word/2010/wordprocessingInk" xmlns:wne="http://schemas.microsoft.com/office/word/2006/wordml" xmlns:wps="http://schemas.microsoft.com/office/word/2010/wordprocessingShape" mc:Ignorable="w14 w15 w16se w16cid w16 w16cex w16sdtdh w16sdtfl w16du wp14">
-  <w:comment w:id="5" w:author="Lachlan Wyer" w:date="2026-05-08T08:19:00Z" w:initials="LW">
+  <w:comment w:id="5" w:author="Lachlan Wyer" w:date="2026-05-10T08:59:00Z" w:initials="LW">
+    <w:p>
+      <w:pPr>
+        <w:pStyle w:val="CommentText"/>
+      </w:pPr>
+      <w:r>
+        <w:rPr>
+          <w:rStyle w:val="CommentReference"/>
+        </w:rPr>
+        <w:annotationRef/>
+      </w:r>
+      <w:r>
+        <w:t>Reference SciKit</w:t>
+      </w:r>
+    </w:p>
+  </w:comment>
+  <w:comment w:id="6" w:author="Lachlan Wyer" w:date="2026-05-08T08:19:00Z" w:initials="LW">
     <w:p>
       <w:pPr>
         <w:pStyle w:val="CommentText"/>
@@ -3429,18 +3509,21 @@
 
 <file path=word/commentsExtended.xml><?xml version="1.0" encoding="utf-8"?>
 <w15:commentsEx xmlns:wpc="http://schemas.microsoft.com/office/word/2010/wordprocessingCanvas" xmlns:cx="http://schemas.microsoft.com/office/drawing/2014/chartex" xmlns:cx1="http://schemas.microsoft.com/office/drawing/2015/9/8/chartex" xmlns:cx2="http://schemas.microsoft.com/office/drawing/2015/10/21/chartex" xmlns:cx3="http://schemas.microsoft.com/office/drawing/2016/5/9/chartex" xmlns:cx4="http://schemas.microsoft.com/office/drawing/2016/5/10/chartex" xmlns:cx5="http://schemas.microsoft.com/office/drawing/2016/5/11/chartex" xmlns:cx6="http://schemas.microsoft.com/office/drawing/2016/5/12/chartex" xmlns:cx7="http://schemas.microsoft.com/office/drawing/2016/5/13/chartex" xmlns:cx8="http://schemas.microsoft.com/office/drawing/2016/5/14/chartex" xmlns:mc="http://schemas.openxmlformats.org/markup-compatibility/2006" xmlns:aink="http://schemas.microsoft.com/office/drawing/2016/ink" xmlns:am3d="http://schemas.microsoft.com/office/drawing/2017/model3d" xmlns:o="urn:schemas-microsoft-com:office:office" xmlns:oel="http://schemas.microsoft.com/office/2019/extlst" xmlns:r="http://schemas.openxmlformats.org/officeDocument/2006/relationships" xmlns:m="http://schemas.openxmlformats.org/officeDocument/2006/math" xmlns:v="urn:schemas-microsoft-com:vml" xmlns:wp14="http://schemas.microsoft.com/office/word/2010/wordprocessingDrawing" xmlns:wp="http://schemas.openxmlformats.org/drawingml/2006/wordprocessingDrawing" xmlns:w10="urn:schemas-microsoft-com:office:word" xmlns:w="http://schemas.openxmlformats.org/wordprocessingml/2006/main" xmlns:w14="http://schemas.microsoft.com/office/word/2010/wordml" xmlns:w15="http://schemas.microsoft.com/office/word/2012/wordml" xmlns:w16cex="http://schemas.microsoft.com/office/word/2018/wordml/cex" xmlns:w16cid="http://schemas.microsoft.com/office/word/2016/wordml/cid" xmlns:w16="http://schemas.microsoft.com/office/word/2018/wordml" xmlns:w16du="http://schemas.microsoft.com/office/word/2023/wordml/word16du" xmlns:w16sdtdh="http://schemas.microsoft.com/office/word/2020/wordml/sdtdatahash" xmlns:w16sdtfl="http://schemas.microsoft.com/office/word/2024/wordml/sdtformatlock" xmlns:w16se="http://schemas.microsoft.com/office/word/2015/wordml/symex" xmlns:wpg="http://schemas.microsoft.com/office/word/2010/wordprocessingGroup" xmlns:wpi="http://schemas.microsoft.com/office/word/2010/wordprocessingInk" xmlns:wne="http://schemas.microsoft.com/office/word/2006/wordml" xmlns:wps="http://schemas.microsoft.com/office/word/2010/wordprocessingShape" mc:Ignorable="w14 w15 w16se w16cid w16 w16cex w16sdtdh w16sdtfl w16du wp14">
+  <w15:commentEx w15:paraId="5D445599" w15:done="0"/>
   <w15:commentEx w15:paraId="0699A2FE" w15:done="0"/>
 </w15:commentsEx>
 </file>
 
 <file path=word/commentsExtensible.xml><?xml version="1.0" encoding="utf-8"?>
 <w16cex:commentsExtensible xmlns:wpc="http://schemas.microsoft.com/office/word/2010/wordprocessingCanvas" xmlns:cx="http://schemas.microsoft.com/office/drawing/2014/chartex" xmlns:cx1="http://schemas.microsoft.com/office/drawing/2015/9/8/chartex" xmlns:cx2="http://schemas.microsoft.com/office/drawing/2015/10/21/chartex" xmlns:cx3="http://schemas.microsoft.com/office/drawing/2016/5/9/chartex" xmlns:cx4="http://schemas.microsoft.com/office/drawing/2016/5/10/chartex" xmlns:cx5="http://schemas.microsoft.com/office/drawing/2016/5/11/chartex" xmlns:cx6="http://schemas.microsoft.com/office/drawing/2016/5/12/chartex" xmlns:cx7="http://schemas.microsoft.com/office/drawing/2016/5/13/chartex" xmlns:cx8="http://schemas.microsoft.com/office/drawing/2016/5/14/chartex" xmlns:cr="http://schemas.microsoft.com/office/comments/2020/reactions" xmlns:mc="http://schemas.openxmlformats.org/markup-compatibility/2006" xmlns:aink="http://schemas.microsoft.com/office/drawing/2016/ink" xmlns:am3d="http://schemas.microsoft.com/office/drawing/2017/model3d" xmlns:o="urn:schemas-microsoft-com:office:office" xmlns:oel="http://schemas.microsoft.com/office/2019/extlst" xmlns:r="http://schemas.openxmlformats.org/officeDocument/2006/relationships" xmlns:m="http://schemas.openxmlformats.org/officeDocument/2006/math" xmlns:v="urn:schemas-microsoft-com:vml" xmlns:wp14="http://schemas.microsoft.com/office/word/2010/wordprocessingDrawing" xmlns:wp="http://schemas.openxmlformats.org/drawingml/2006/wordprocessingDrawing" xmlns:w10="urn:schemas-microsoft-com:office:word" xmlns:w="http://schemas.openxmlformats.org/wordprocessingml/2006/main" xmlns:w14="http://schemas.microsoft.com/office/word/2010/wordml" xmlns:w15="http://schemas.microsoft.com/office/word/2012/wordml" xmlns:w16cex="http://schemas.microsoft.com/office/word/2018/wordml/cex" xmlns:w16cid="http://schemas.microsoft.com/office/word/2016/wordml/cid" xmlns:w16="http://schemas.microsoft.com/office/word/2018/wordml" xmlns:w16du="http://schemas.microsoft.com/office/word/2023/wordml/word16du" xmlns:w16sdtdh="http://schemas.microsoft.com/office/word/2020/wordml/sdtdatahash" xmlns:w16sdtfl="http://schemas.microsoft.com/office/word/2024/wordml/sdtformatlock" xmlns:w16se="http://schemas.microsoft.com/office/word/2015/wordml/symex" xmlns:wpg="http://schemas.microsoft.com/office/word/2010/wordprocessingGroup" xmlns:wpi="http://schemas.microsoft.com/office/word/2010/wordprocessingInk" xmlns:wne="http://schemas.microsoft.com/office/word/2006/wordml" xmlns:wps="http://schemas.microsoft.com/office/word/2010/wordprocessingShape" mc:Ignorable="w14 w15 w16se w16cid w16 w16cex w16sdtdh w16sdtfl cr w16du wp14">
+  <w16cex:commentExtensible w16cex:durableId="000BF91D" w16cex:dateUtc="2026-05-09T22:59:00Z"/>
   <w16cex:commentExtensible w16cex:durableId="04610A52" w16cex:dateUtc="2026-05-07T22:19:00Z"/>
 </w16cex:commentsExtensible>
 </file>
 
 <file path=word/commentsIds.xml><?xml version="1.0" encoding="utf-8"?>
 <w16cid:commentsIds xmlns:wpc="http://schemas.microsoft.com/office/word/2010/wordprocessingCanvas" xmlns:cx="http://schemas.microsoft.com/office/drawing/2014/chartex" xmlns:cx1="http://schemas.microsoft.com/office/drawing/2015/9/8/chartex" xmlns:cx2="http://schemas.microsoft.com/office/drawing/2015/10/21/chartex" xmlns:cx3="http://schemas.microsoft.com/office/drawing/2016/5/9/chartex" xmlns:cx4="http://schemas.microsoft.com/office/drawing/2016/5/10/chartex" xmlns:cx5="http://schemas.microsoft.com/office/drawing/2016/5/11/chartex" xmlns:cx6="http://schemas.microsoft.com/office/drawing/2016/5/12/chartex" xmlns:cx7="http://schemas.microsoft.com/office/drawing/2016/5/13/chartex" xmlns:cx8="http://schemas.microsoft.com/office/drawing/2016/5/14/chartex" xmlns:mc="http://schemas.openxmlformats.org/markup-compatibility/2006" xmlns:aink="http://schemas.microsoft.com/office/drawing/2016/ink" xmlns:am3d="http://schemas.microsoft.com/office/drawing/2017/model3d" xmlns:o="urn:schemas-microsoft-com:office:office" xmlns:oel="http://schemas.microsoft.com/office/2019/extlst" xmlns:r="http://schemas.openxmlformats.org/officeDocument/2006/relationships" xmlns:m="http://schemas.openxmlformats.org/officeDocument/2006/math" xmlns:v="urn:schemas-microsoft-com:vml" xmlns:wp14="http://schemas.microsoft.com/office/word/2010/wordprocessingDrawing" xmlns:wp="http://schemas.openxmlformats.org/drawingml/2006/wordprocessingDrawing" xmlns:w10="urn:schemas-microsoft-com:office:word" xmlns:w="http://schemas.openxmlformats.org/wordprocessingml/2006/main" xmlns:w14="http://schemas.microsoft.com/office/word/2010/wordml" xmlns:w15="http://schemas.microsoft.com/office/word/2012/wordml" xmlns:w16cex="http://schemas.microsoft.com/office/word/2018/wordml/cex" xmlns:w16cid="http://schemas.microsoft.com/office/word/2016/wordml/cid" xmlns:w16="http://schemas.microsoft.com/office/word/2018/wordml" xmlns:w16du="http://schemas.microsoft.com/office/word/2023/wordml/word16du" xmlns:w16sdtdh="http://schemas.microsoft.com/office/word/2020/wordml/sdtdatahash" xmlns:w16sdtfl="http://schemas.microsoft.com/office/word/2024/wordml/sdtformatlock" xmlns:w16se="http://schemas.microsoft.com/office/word/2015/wordml/symex" xmlns:wpg="http://schemas.microsoft.com/office/word/2010/wordprocessingGroup" xmlns:wpi="http://schemas.microsoft.com/office/word/2010/wordprocessingInk" xmlns:wne="http://schemas.microsoft.com/office/word/2006/wordml" xmlns:wps="http://schemas.microsoft.com/office/word/2010/wordprocessingShape" mc:Ignorable="w14 w15 w16se w16cid w16 w16cex w16sdtdh w16sdtfl w16du wp14">
+  <w16cid:commentId w16cid:paraId="5D445599" w16cid:durableId="000BF91D"/>
   <w16cid:commentId w16cid:paraId="0699A2FE" w16cid:durableId="04610A52"/>
 </w16cid:commentsIds>
 </file>

</xml_diff>